<commit_message>
Add webhook_request.py to send GET requests to audit status webhook
- Implemented a script that uses curl to send a GET request to a specified webhook URL.
- Included error handling for subprocess execution and response output.
- Configured API key as a header for authentication.
</commit_message>
<xml_diff>
--- a/docs/PROJECT-STATUS-REPORT-TECHNICAL.docx
+++ b/docs/PROJECT-STATUS-REPORT-TECHNICAL.docx
@@ -1,11 +1,12 @@
 
 <file path=word/document.xml><?xml version="1.0" encoding="utf-8"?>
-<w:document xmlns:wpc="http://schemas.microsoft.com/office/word/2010/wordprocessingCanvas" xmlns:cx="http://schemas.microsoft.com/office/drawing/2014/chartex" xmlns:cx1="http://schemas.microsoft.com/office/drawing/2015/9/8/chartex" xmlns:cx2="http://schemas.microsoft.com/office/drawing/2015/10/21/chartex" xmlns:cx3="http://schemas.microsoft.com/office/drawing/2016/5/9/chartex" xmlns:cx4="http://schemas.microsoft.com/office/drawing/2016/5/10/chartex" xmlns:cx5="http://schemas.microsoft.com/office/drawing/2016/5/11/chartex" xmlns:cx6="http://schemas.microsoft.com/office/drawing/2016/5/12/chartex" xmlns:cx7="http://schemas.microsoft.com/office/drawing/2016/5/13/chartex" xmlns:cx8="http://schemas.microsoft.com/office/drawing/2016/5/14/chartex" xmlns:mc="http://schemas.openxmlformats.org/markup-compatibility/2006" xmlns:aink="http://schemas.microsoft.com/office/drawing/2016/ink" xmlns:am3d="http://schemas.microsoft.com/office/drawing/2017/model3d" xmlns:o="urn:schemas-microsoft-com:office:office" xmlns:oel="http://schemas.microsoft.com/office/2019/extlst" xmlns:r="http://schemas.openxmlformats.org/officeDocument/2006/relationships" xmlns:m="http://schemas.openxmlformats.org/officeDocument/2006/math" xmlns:v="urn:schemas-microsoft-com:vml" xmlns:wp14="http://schemas.microsoft.com/office/word/2010/wordprocessingDrawing" xmlns:wp="http://schemas.openxmlformats.org/drawingml/2006/wordprocessingDrawing" xmlns:w10="urn:schemas-microsoft-com:office:word" xmlns:w="http://schemas.openxmlformats.org/wordprocessingml/2006/main" xmlns:w14="http://schemas.microsoft.com/office/word/2010/wordml" xmlns:w15="http://schemas.microsoft.com/office/word/2012/wordml" xmlns:w16cex="http://schemas.microsoft.com/office/word/2018/wordml/cex" xmlns:w16cid="http://schemas.microsoft.com/office/word/2016/wordml/cid" xmlns:w16="http://schemas.microsoft.com/office/word/2018/wordml" xmlns:w16du="http://schemas.microsoft.com/office/word/2023/wordml/word16du" xmlns:w16sdtdh="http://schemas.microsoft.com/office/word/2020/wordml/sdtdatahash" xmlns:w16se="http://schemas.microsoft.com/office/word/2015/wordml/symex" xmlns:wpg="http://schemas.microsoft.com/office/word/2010/wordprocessingGroup" xmlns:wpi="http://schemas.microsoft.com/office/word/2010/wordprocessingInk" xmlns:wne="http://schemas.microsoft.com/office/word/2006/wordml" xmlns:wps="http://schemas.microsoft.com/office/word/2010/wordprocessingShape" mc:Ignorable="w14 w15 w16se w16cid w16 w16cex w16sdtdh w16du wp14">
+<w:document xmlns:wpc="http://schemas.microsoft.com/office/word/2010/wordprocessingCanvas" xmlns:cx="http://schemas.microsoft.com/office/drawing/2014/chartex" xmlns:cx1="http://schemas.microsoft.com/office/drawing/2015/9/8/chartex" xmlns:cx2="http://schemas.microsoft.com/office/drawing/2015/10/21/chartex" xmlns:cx3="http://schemas.microsoft.com/office/drawing/2016/5/9/chartex" xmlns:cx4="http://schemas.microsoft.com/office/drawing/2016/5/10/chartex" xmlns:cx5="http://schemas.microsoft.com/office/drawing/2016/5/11/chartex" xmlns:cx6="http://schemas.microsoft.com/office/drawing/2016/5/12/chartex" xmlns:cx7="http://schemas.microsoft.com/office/drawing/2016/5/13/chartex" xmlns:cx8="http://schemas.microsoft.com/office/drawing/2016/5/14/chartex" xmlns:mc="http://schemas.openxmlformats.org/markup-compatibility/2006" xmlns:aink="http://schemas.microsoft.com/office/drawing/2016/ink" xmlns:am3d="http://schemas.microsoft.com/office/drawing/2017/model3d" xmlns:o="urn:schemas-microsoft-com:office:office" xmlns:oel="http://schemas.microsoft.com/office/2019/extlst" xmlns:r="http://schemas.openxmlformats.org/officeDocument/2006/relationships" xmlns:m="http://schemas.openxmlformats.org/officeDocument/2006/math" xmlns:v="urn:schemas-microsoft-com:vml" xmlns:wp14="http://schemas.microsoft.com/office/word/2010/wordprocessingDrawing" xmlns:wp="http://schemas.openxmlformats.org/drawingml/2006/wordprocessingDrawing" xmlns:w10="urn:schemas-microsoft-com:office:word" xmlns:w="http://schemas.openxmlformats.org/wordprocessingml/2006/main" xmlns:w14="http://schemas.microsoft.com/office/word/2010/wordml" xmlns:w15="http://schemas.microsoft.com/office/word/2012/wordml" xmlns:w16cex="http://schemas.microsoft.com/office/word/2018/wordml/cex" xmlns:w16cid="http://schemas.microsoft.com/office/word/2016/wordml/cid" xmlns:w16="http://schemas.microsoft.com/office/word/2018/wordml" xmlns:w16sdtdh="http://schemas.microsoft.com/office/word/2020/wordml/sdtdatahash" xmlns:w16se="http://schemas.microsoft.com/office/word/2015/wordml/symex" xmlns:wpg="http://schemas.microsoft.com/office/word/2010/wordprocessingGroup" xmlns:wpi="http://schemas.microsoft.com/office/word/2010/wordprocessingInk" xmlns:wne="http://schemas.microsoft.com/office/word/2006/wordml" xmlns:wps="http://schemas.microsoft.com/office/word/2010/wordprocessingShape" mc:Ignorable="w14 w15 w16se w16cid w16 w16cex w16sdtdh wp14">
   <w:body>
     <w:p>
       <w:pPr>
         <w:pStyle w:val="Heading1"/>
         <w:rPr>
+          <w:rFonts w:ascii="Calibri" w:hAnsi="Calibri" w:cs="Calibri"/>
           <w:sz w:val="44"/>
           <w:szCs w:val="44"/>
         </w:rPr>
@@ -13,6 +14,7 @@
       <w:bookmarkStart w:id="0" w:name="X003e0ca553863a4a5da79c4d2367a875b64f5e8"/>
       <w:r>
         <w:rPr>
+          <w:rFonts w:ascii="Calibri" w:hAnsi="Calibri" w:cs="Calibri"/>
           <w:sz w:val="44"/>
           <w:szCs w:val="44"/>
         </w:rPr>
@@ -22,230 +24,331 @@
     <w:p>
       <w:pPr>
         <w:pStyle w:val="FirstParagraph"/>
-      </w:pPr>
-      <w:r>
-        <w:rPr>
+        <w:rPr>
+          <w:rFonts w:ascii="Calibri" w:hAnsi="Calibri" w:cs="Calibri"/>
+        </w:rPr>
+      </w:pPr>
+      <w:r>
+        <w:rPr>
+          <w:rFonts w:ascii="Calibri" w:hAnsi="Calibri" w:cs="Calibri"/>
           <w:b/>
           <w:bCs/>
         </w:rPr>
         <w:t>Project:</w:t>
       </w:r>
       <w:r>
+        <w:rPr>
+          <w:rFonts w:ascii="Calibri" w:hAnsi="Calibri" w:cs="Calibri"/>
+        </w:rPr>
         <w:t xml:space="preserve"> n8n Compliance AI Document Intelligence Engine </w:t>
       </w:r>
     </w:p>
     <w:p>
       <w:pPr>
         <w:pStyle w:val="FirstParagraph"/>
-      </w:pPr>
-      <w:r>
-        <w:rPr>
+        <w:rPr>
+          <w:rFonts w:ascii="Calibri" w:hAnsi="Calibri" w:cs="Calibri"/>
+        </w:rPr>
+      </w:pPr>
+      <w:r>
+        <w:rPr>
+          <w:rFonts w:ascii="Calibri" w:hAnsi="Calibri" w:cs="Calibri"/>
           <w:b/>
           <w:bCs/>
         </w:rPr>
         <w:t>Document Date:</w:t>
       </w:r>
       <w:r>
+        <w:rPr>
+          <w:rFonts w:ascii="Calibri" w:hAnsi="Calibri" w:cs="Calibri"/>
+        </w:rPr>
         <w:t xml:space="preserve"> March 4, 2026</w:t>
       </w:r>
     </w:p>
     <w:p>
-      <w:r>
-        <w:rPr>
-          <w:b/>
-          <w:bCs/>
-        </w:rPr>
-        <w:t>By</w:t>
-      </w:r>
-      <w:r>
-        <w:rPr>
-          <w:b/>
-          <w:bCs/>
-        </w:rPr>
-        <w:t>:</w:t>
-      </w:r>
-      <w:r>
+      <w:pPr>
+        <w:rPr>
+          <w:rFonts w:ascii="Calibri" w:hAnsi="Calibri" w:cs="Calibri"/>
+        </w:rPr>
+      </w:pPr>
+      <w:r>
+        <w:rPr>
+          <w:rFonts w:ascii="Calibri" w:hAnsi="Calibri" w:cs="Calibri"/>
+          <w:b/>
+          <w:bCs/>
+        </w:rPr>
+        <w:t>By:</w:t>
+      </w:r>
+      <w:r>
+        <w:rPr>
+          <w:rFonts w:ascii="Calibri" w:hAnsi="Calibri" w:cs="Calibri"/>
+        </w:rPr>
+        <w:t xml:space="preserve"> Roshan Lal</w:t>
+      </w:r>
+    </w:p>
+    <w:p>
+      <w:pPr>
+        <w:rPr>
+          <w:rFonts w:ascii="Calibri" w:hAnsi="Calibri" w:cs="Calibri"/>
+        </w:rPr>
+      </w:pPr>
+      <w:r>
+        <w:rPr>
+          <w:rFonts w:ascii="Calibri" w:hAnsi="Calibri" w:cs="Calibri"/>
+        </w:rPr>
+        <w:pict w14:anchorId="021A7319">
+          <v:rect id="_x0000_i1441" style="width:0;height:1.5pt" o:hralign="center" o:hrstd="t" o:hr="t"/>
+        </w:pict>
+      </w:r>
+    </w:p>
+    <w:p>
+      <w:pPr>
+        <w:pStyle w:val="Heading2"/>
+        <w:rPr>
+          <w:rFonts w:ascii="Calibri" w:hAnsi="Calibri" w:cs="Calibri"/>
+        </w:rPr>
+      </w:pPr>
+      <w:bookmarkStart w:id="1" w:name="executive-summary"/>
+      <w:r>
+        <w:rPr>
+          <w:rFonts w:ascii="Calibri" w:hAnsi="Calibri" w:cs="Calibri"/>
+        </w:rPr>
+        <w:t>Summary</w:t>
+      </w:r>
+    </w:p>
+    <w:p>
+      <w:pPr>
+        <w:pStyle w:val="FirstParagraph"/>
+        <w:rPr>
+          <w:rFonts w:ascii="Calibri" w:hAnsi="Calibri" w:cs="Calibri"/>
+        </w:rPr>
+      </w:pPr>
+      <w:r>
+        <w:rPr>
+          <w:rFonts w:ascii="Calibri" w:hAnsi="Calibri" w:cs="Calibri"/>
+        </w:rPr>
+        <w:t>The NPC Compliance AI Document Intelligence System is an operational AI-powered Document Intelligence Engine that valuates organizational compliance against 12 data management domains using document analysis, vision AI, and retrieval-augmented generation (RAG). The system is deployed on Azure infrastructure with GPU acceleration and is fully production-ready.</w:t>
+      </w:r>
+    </w:p>
+    <w:p>
+      <w:pPr>
+        <w:pStyle w:val="BodyText"/>
+        <w:rPr>
+          <w:rFonts w:ascii="Calibri" w:hAnsi="Calibri" w:cs="Calibri"/>
+        </w:rPr>
+      </w:pPr>
+      <w:r>
+        <w:rPr>
+          <w:rFonts w:ascii="Calibri" w:hAnsi="Calibri" w:cs="Calibri"/>
+          <w:b/>
+          <w:bCs/>
+        </w:rPr>
+        <w:t>Key Capabilities:</w:t>
+      </w:r>
+      <w:r>
+        <w:rPr>
+          <w:rFonts w:ascii="Calibri" w:hAnsi="Calibri" w:cs="Calibri"/>
+        </w:rPr>
         <w:t xml:space="preserve"> </w:t>
       </w:r>
-      <w:r>
-        <w:t>Roshan Lal</w:t>
-      </w:r>
-    </w:p>
-    <w:p>
-      <w:r>
-        <w:pict w14:anchorId="021A7319">
-          <v:rect id="_x0000_i1240" style="width:0;height:1.5pt" o:hralign="center" o:hrstd="t" o:hr="t"/>
+    </w:p>
+    <w:p>
+      <w:pPr>
+        <w:pStyle w:val="BodyText"/>
+        <w:rPr>
+          <w:rFonts w:ascii="Calibri" w:hAnsi="Calibri" w:cs="Calibri"/>
+        </w:rPr>
+      </w:pPr>
+      <w:r>
+        <w:rPr>
+          <w:rFonts w:ascii="Calibri" w:hAnsi="Calibri" w:cs="Calibri"/>
+        </w:rPr>
+        <w:t xml:space="preserve">- </w:t>
+      </w:r>
+      <w:r>
+        <w:rPr>
+          <w:rFonts w:ascii="Calibri" w:hAnsi="Calibri" w:cs="Calibri"/>
+          <w:b/>
+          <w:bCs/>
+        </w:rPr>
+        <w:t>6 Operational Workflows:</w:t>
+      </w:r>
+      <w:r>
+        <w:rPr>
+          <w:rFonts w:ascii="Calibri" w:hAnsi="Calibri" w:cs="Calibri"/>
+        </w:rPr>
+        <w:t xml:space="preserve"> Handles extraction, ingestion, and background evaluation. </w:t>
+      </w:r>
+    </w:p>
+    <w:p>
+      <w:pPr>
+        <w:pStyle w:val="BodyText"/>
+        <w:rPr>
+          <w:rFonts w:ascii="Calibri" w:hAnsi="Calibri" w:cs="Calibri"/>
+        </w:rPr>
+      </w:pPr>
+      <w:r>
+        <w:rPr>
+          <w:rFonts w:ascii="Calibri" w:hAnsi="Calibri" w:cs="Calibri"/>
+        </w:rPr>
+        <w:t xml:space="preserve">- </w:t>
+      </w:r>
+      <w:r>
+        <w:rPr>
+          <w:rFonts w:ascii="Calibri" w:hAnsi="Calibri" w:cs="Calibri"/>
+          <w:b/>
+          <w:bCs/>
+        </w:rPr>
+        <w:t>Microservices Architecture:</w:t>
+      </w:r>
+      <w:r>
+        <w:rPr>
+          <w:rFonts w:ascii="Calibri" w:hAnsi="Calibri" w:cs="Calibri"/>
+        </w:rPr>
+        <w:t xml:space="preserve"> 6 cleanly decoupled containerized services orchestrated via Docker Compose. </w:t>
+      </w:r>
+    </w:p>
+    <w:p>
+      <w:pPr>
+        <w:pStyle w:val="BodyText"/>
+        <w:rPr>
+          <w:rFonts w:ascii="Calibri" w:hAnsi="Calibri" w:cs="Calibri"/>
+        </w:rPr>
+      </w:pPr>
+      <w:r>
+        <w:rPr>
+          <w:rFonts w:ascii="Calibri" w:hAnsi="Calibri" w:cs="Calibri"/>
+        </w:rPr>
+        <w:t xml:space="preserve">- </w:t>
+      </w:r>
+      <w:r>
+        <w:rPr>
+          <w:rFonts w:ascii="Calibri" w:hAnsi="Calibri" w:cs="Calibri"/>
+          <w:b/>
+          <w:bCs/>
+        </w:rPr>
+        <w:t>Compliance Scope:</w:t>
+      </w:r>
+      <w:r>
+        <w:rPr>
+          <w:rFonts w:ascii="Calibri" w:hAnsi="Calibri" w:cs="Calibri"/>
+        </w:rPr>
+        <w:t xml:space="preserve"> 159 audit questions across 12 domains. </w:t>
+      </w:r>
+    </w:p>
+    <w:p>
+      <w:pPr>
+        <w:pStyle w:val="BodyText"/>
+        <w:rPr>
+          <w:rFonts w:ascii="Calibri" w:hAnsi="Calibri" w:cs="Calibri"/>
+        </w:rPr>
+      </w:pPr>
+      <w:r>
+        <w:rPr>
+          <w:rFonts w:ascii="Calibri" w:hAnsi="Calibri" w:cs="Calibri"/>
+        </w:rPr>
+        <w:t xml:space="preserve">- </w:t>
+      </w:r>
+      <w:r>
+        <w:rPr>
+          <w:rFonts w:ascii="Calibri" w:hAnsi="Calibri" w:cs="Calibri"/>
+          <w:b/>
+          <w:bCs/>
+        </w:rPr>
+        <w:t>AI/ML Engine:</w:t>
+      </w:r>
+      <w:r>
+        <w:rPr>
+          <w:rFonts w:ascii="Calibri" w:hAnsi="Calibri" w:cs="Calibri"/>
+        </w:rPr>
+        <w:t xml:space="preserve"> GPU-accelerated inference utilizing Mistral Nemo 12B and Florence-2-large-ft. </w:t>
+      </w:r>
+    </w:p>
+    <w:p>
+      <w:pPr>
+        <w:pStyle w:val="BodyText"/>
+        <w:rPr>
+          <w:rFonts w:ascii="Calibri" w:hAnsi="Calibri" w:cs="Calibri"/>
+        </w:rPr>
+      </w:pPr>
+      <w:r>
+        <w:rPr>
+          <w:rFonts w:ascii="Calibri" w:hAnsi="Calibri" w:cs="Calibri"/>
+        </w:rPr>
+        <w:t xml:space="preserve">- </w:t>
+      </w:r>
+      <w:r>
+        <w:rPr>
+          <w:rFonts w:ascii="Calibri" w:hAnsi="Calibri" w:cs="Calibri"/>
+          <w:b/>
+          <w:bCs/>
+        </w:rPr>
+        <w:t>Caching Layer:</w:t>
+      </w:r>
+      <w:r>
+        <w:rPr>
+          <w:rFonts w:ascii="Calibri" w:hAnsi="Calibri" w:cs="Calibri"/>
+        </w:rPr>
+        <w:t xml:space="preserve"> Master caching system bypassing redundant evaluations.</w:t>
+      </w:r>
+    </w:p>
+    <w:p>
+      <w:pPr>
+        <w:pStyle w:val="BodyText"/>
+        <w:rPr>
+          <w:rFonts w:ascii="Calibri" w:hAnsi="Calibri" w:cs="Calibri"/>
+        </w:rPr>
+      </w:pPr>
+      <w:r>
+        <w:rPr>
+          <w:rFonts w:ascii="Calibri" w:hAnsi="Calibri" w:cs="Calibri"/>
+        </w:rPr>
+        <w:t xml:space="preserve">- </w:t>
+      </w:r>
+      <w:r>
+        <w:rPr>
+          <w:rFonts w:ascii="Calibri" w:hAnsi="Calibri" w:cs="Calibri"/>
+          <w:b/>
+          <w:bCs/>
+        </w:rPr>
+        <w:t>Low-Code N8n:</w:t>
+      </w:r>
+      <w:r>
+        <w:rPr>
+          <w:rFonts w:ascii="Calibri" w:hAnsi="Calibri" w:cs="Calibri"/>
+        </w:rPr>
+        <w:t xml:space="preserve"> Low-Code n8n tool utilized for rapid prototyping and deployment.</w:t>
+      </w:r>
+    </w:p>
+    <w:p>
+      <w:pPr>
+        <w:pStyle w:val="BodyText"/>
+        <w:rPr>
+          <w:rFonts w:ascii="Calibri" w:hAnsi="Calibri" w:cs="Calibri"/>
+        </w:rPr>
+      </w:pPr>
+    </w:p>
+    <w:p>
+      <w:pPr>
+        <w:rPr>
+          <w:rFonts w:ascii="Calibri" w:hAnsi="Calibri" w:cs="Calibri"/>
+        </w:rPr>
+      </w:pPr>
+      <w:r>
+        <w:rPr>
+          <w:rFonts w:ascii="Calibri" w:hAnsi="Calibri" w:cs="Calibri"/>
+        </w:rPr>
+        <w:pict w14:anchorId="4BBE3643">
+          <v:rect id="_x0000_i1442" style="width:0;height:1.5pt" o:hralign="center" o:bullet="t" o:hrstd="t" o:hr="t"/>
         </w:pict>
       </w:r>
     </w:p>
     <w:p>
       <w:pPr>
-        <w:pStyle w:val="Heading2"/>
-      </w:pPr>
-      <w:bookmarkStart w:id="1" w:name="executive-summary"/>
-      <w:r>
-        <w:t>Summary</w:t>
-      </w:r>
-    </w:p>
-    <w:p>
-      <w:pPr>
-        <w:pStyle w:val="FirstParagraph"/>
-      </w:pPr>
-      <w:r>
-        <w:t>The NPC Compliance AI Document Intelligence System is an operational AI-powered Document Intelligence Engine that valuates organizational compliance against 12 data management domains using document analysis, vision AI, and retrieval-augmented generation (RAG). The system is deployed on Azure infrastructure with GPU acceleration and is fully production-ready.</w:t>
-      </w:r>
-    </w:p>
-    <w:p>
-      <w:pPr>
         <w:pStyle w:val="BodyText"/>
-      </w:pPr>
-      <w:r>
-        <w:rPr>
-          <w:b/>
-          <w:bCs/>
-        </w:rPr>
-        <w:t>Key Capabilities:</w:t>
-      </w:r>
-      <w:r>
-        <w:t xml:space="preserve"> </w:t>
-      </w:r>
-    </w:p>
-    <w:p>
-      <w:pPr>
-        <w:pStyle w:val="BodyText"/>
-      </w:pPr>
-      <w:r>
-        <w:t xml:space="preserve">- </w:t>
-      </w:r>
-      <w:r>
-        <w:rPr>
-          <w:b/>
-          <w:bCs/>
-        </w:rPr>
-        <w:t>6 Operational Workflows:</w:t>
-      </w:r>
-      <w:r>
-        <w:t xml:space="preserve"> Handles extraction, ingestion, and background evaluation. </w:t>
-      </w:r>
-    </w:p>
-    <w:p>
-      <w:pPr>
-        <w:pStyle w:val="BodyText"/>
-      </w:pPr>
-      <w:r>
-        <w:t xml:space="preserve">- </w:t>
-      </w:r>
-      <w:r>
-        <w:rPr>
-          <w:b/>
-          <w:bCs/>
-        </w:rPr>
-        <w:t>Microservices Architecture:</w:t>
-      </w:r>
-      <w:r>
-        <w:t xml:space="preserve"> 6 cleanly decoupled containerized services orchestrated via Docker Compose. </w:t>
-      </w:r>
-    </w:p>
-    <w:p>
-      <w:pPr>
-        <w:pStyle w:val="BodyText"/>
-      </w:pPr>
-      <w:r>
-        <w:t xml:space="preserve">- </w:t>
-      </w:r>
-      <w:r>
-        <w:rPr>
-          <w:b/>
-          <w:bCs/>
-        </w:rPr>
-        <w:t>Compliance Scope:</w:t>
-      </w:r>
-      <w:r>
-        <w:t xml:space="preserve"> 159 audit questions across 12 domains. </w:t>
-      </w:r>
-    </w:p>
-    <w:p>
-      <w:pPr>
-        <w:pStyle w:val="BodyText"/>
-      </w:pPr>
-      <w:r>
-        <w:t xml:space="preserve">- </w:t>
-      </w:r>
-      <w:r>
-        <w:rPr>
-          <w:b/>
-          <w:bCs/>
-        </w:rPr>
-        <w:t>AI/ML Engine:</w:t>
-      </w:r>
-      <w:r>
-        <w:t xml:space="preserve"> GPU-accelerated inference utilizing Mistral Nemo 12B and Florence-2-large-ft. </w:t>
-      </w:r>
-    </w:p>
-    <w:p>
-      <w:pPr>
-        <w:pStyle w:val="BodyText"/>
-      </w:pPr>
-      <w:r>
-        <w:t xml:space="preserve">- </w:t>
-      </w:r>
-      <w:r>
-        <w:rPr>
-          <w:b/>
-          <w:bCs/>
-        </w:rPr>
-        <w:t>Caching Layer:</w:t>
-      </w:r>
-      <w:r>
-        <w:t xml:space="preserve"> Master caching system bypassing redundant evaluations.</w:t>
-      </w:r>
-    </w:p>
-    <w:p>
-      <w:pPr>
-        <w:pStyle w:val="BodyText"/>
-      </w:pPr>
-      <w:r>
-        <w:t xml:space="preserve">- </w:t>
-      </w:r>
-      <w:r>
-        <w:rPr>
-          <w:b/>
-          <w:bCs/>
-        </w:rPr>
-        <w:t>Low-Code N8n</w:t>
-      </w:r>
-      <w:r>
-        <w:rPr>
-          <w:b/>
-          <w:bCs/>
-        </w:rPr>
-        <w:t>:</w:t>
-      </w:r>
-      <w:r>
-        <w:t xml:space="preserve"> </w:t>
-      </w:r>
-      <w:r>
-        <w:t>Low-Code n8n tool utilized for rapid prototyping and deployment</w:t>
-      </w:r>
-      <w:r>
-        <w:t>.</w:t>
-      </w:r>
-    </w:p>
-    <w:p>
-      <w:pPr>
-        <w:pStyle w:val="BodyText"/>
-      </w:pPr>
-    </w:p>
-    <w:p>
-      <w:r>
-        <w:pict w14:anchorId="4BBE3643">
-          <v:rect id="_x0000_i1251" style="width:0;height:1.5pt" o:hralign="center" o:bullet="t" o:hrstd="t" o:hr="t"/>
-        </w:pict>
-      </w:r>
-    </w:p>
-    <w:p>
-      <w:pPr>
-        <w:pStyle w:val="BodyText"/>
+        <w:rPr>
+          <w:rFonts w:ascii="Calibri" w:hAnsi="Calibri" w:cs="Calibri"/>
+        </w:rPr>
       </w:pPr>
       <w:bookmarkStart w:id="2" w:name="system-architecture-overview"/>
       <w:bookmarkEnd w:id="1"/>
@@ -253,34 +356,56 @@
     <w:p>
       <w:pPr>
         <w:pStyle w:val="Heading2"/>
-      </w:pPr>
-      <w:r>
+        <w:rPr>
+          <w:rFonts w:ascii="Calibri" w:hAnsi="Calibri" w:cs="Calibri"/>
+        </w:rPr>
+      </w:pPr>
+      <w:r>
+        <w:rPr>
+          <w:rFonts w:ascii="Calibri" w:hAnsi="Calibri" w:cs="Calibri"/>
+        </w:rPr>
         <w:t>1. System Architecture Overview</w:t>
       </w:r>
     </w:p>
     <w:p>
       <w:pPr>
         <w:pStyle w:val="Heading3"/>
+        <w:rPr>
+          <w:rFonts w:ascii="Calibri" w:hAnsi="Calibri" w:cs="Calibri"/>
+        </w:rPr>
       </w:pPr>
       <w:bookmarkStart w:id="3" w:name="high-level-architecture"/>
       <w:r>
+        <w:rPr>
+          <w:rFonts w:ascii="Calibri" w:hAnsi="Calibri" w:cs="Calibri"/>
+        </w:rPr>
         <w:t>1.1 High-Level Architecture</w:t>
       </w:r>
     </w:p>
     <w:p>
       <w:pPr>
         <w:pStyle w:val="FirstParagraph"/>
-      </w:pPr>
-      <w:r>
+        <w:rPr>
+          <w:rFonts w:ascii="Calibri" w:hAnsi="Calibri" w:cs="Calibri"/>
+        </w:rPr>
+      </w:pPr>
+      <w:r>
+        <w:rPr>
+          <w:rFonts w:ascii="Calibri" w:hAnsi="Calibri" w:cs="Calibri"/>
+        </w:rPr>
         <w:t>The system uses an async job queue with six workflows that handle different parts of the process:</w:t>
       </w:r>
     </w:p>
     <w:p>
       <w:pPr>
         <w:pStyle w:val="SourceCode"/>
-      </w:pPr>
-      <w:r>
-        <w:rPr>
+        <w:rPr>
+          <w:rFonts w:ascii="Calibri" w:hAnsi="Calibri" w:cs="Calibri"/>
+        </w:rPr>
+      </w:pPr>
+      <w:r>
+        <w:rPr>
+          <w:rFonts w:ascii="Calibri" w:hAnsi="Calibri" w:cs="Calibri"/>
           <w:noProof/>
         </w:rPr>
         <w:lastRenderedPageBreak/>
@@ -331,55 +456,89 @@
       </w:r>
     </w:p>
     <w:p>
-      <w:r>
+      <w:pPr>
+        <w:rPr>
+          <w:rFonts w:ascii="Calibri" w:hAnsi="Calibri" w:cs="Calibri"/>
+        </w:rPr>
+      </w:pPr>
+      <w:r>
+        <w:rPr>
+          <w:rFonts w:ascii="Calibri" w:hAnsi="Calibri" w:cs="Calibri"/>
+        </w:rPr>
         <w:pict w14:anchorId="5B347A50">
-          <v:rect id="_x0000_i1241" style="width:0;height:1.5pt" o:hralign="center" o:hrstd="t" o:hr="t"/>
+          <v:rect id="_x0000_i1443" style="width:0;height:1.5pt" o:hralign="center" o:hrstd="t" o:hr="t"/>
         </w:pict>
       </w:r>
     </w:p>
     <w:p>
       <w:pPr>
         <w:pStyle w:val="Heading2"/>
+        <w:rPr>
+          <w:rFonts w:ascii="Calibri" w:hAnsi="Calibri" w:cs="Calibri"/>
+        </w:rPr>
       </w:pPr>
       <w:bookmarkStart w:id="4" w:name="microservices-deep-dive"/>
       <w:bookmarkEnd w:id="2"/>
       <w:bookmarkEnd w:id="3"/>
       <w:r>
+        <w:rPr>
+          <w:rFonts w:ascii="Calibri" w:hAnsi="Calibri" w:cs="Calibri"/>
+        </w:rPr>
         <w:t>2. Microservices Deep-Dive</w:t>
       </w:r>
     </w:p>
     <w:p>
       <w:pPr>
         <w:pStyle w:val="FirstParagraph"/>
-      </w:pPr>
-      <w:r>
+        <w:rPr>
+          <w:rFonts w:ascii="Calibri" w:hAnsi="Calibri" w:cs="Calibri"/>
+        </w:rPr>
+      </w:pPr>
+      <w:r>
+        <w:rPr>
+          <w:rFonts w:ascii="Calibri" w:hAnsi="Calibri" w:cs="Calibri"/>
+        </w:rPr>
         <w:t>The system is deployed as a suite of 6 tightly integrated Docker containers managed via Docker Compose (</w:t>
       </w:r>
       <w:r>
         <w:rPr>
           <w:rStyle w:val="VerbatimChar"/>
+          <w:rFonts w:ascii="Calibri" w:hAnsi="Calibri" w:cs="Calibri"/>
         </w:rPr>
         <w:t>docker-compose.prod.yml</w:t>
       </w:r>
       <w:r>
+        <w:rPr>
+          <w:rFonts w:ascii="Calibri" w:hAnsi="Calibri" w:cs="Calibri"/>
+        </w:rPr>
         <w:t>), operating on a dedicated bridge network (</w:t>
       </w:r>
       <w:r>
         <w:rPr>
           <w:rStyle w:val="VerbatimChar"/>
+          <w:rFonts w:ascii="Calibri" w:hAnsi="Calibri" w:cs="Calibri"/>
         </w:rPr>
         <w:t>compliance-network</w:t>
       </w:r>
       <w:r>
+        <w:rPr>
+          <w:rFonts w:ascii="Calibri" w:hAnsi="Calibri" w:cs="Calibri"/>
+        </w:rPr>
         <w:t>).</w:t>
       </w:r>
     </w:p>
     <w:p>
       <w:pPr>
         <w:pStyle w:val="Heading3"/>
+        <w:rPr>
+          <w:rFonts w:ascii="Calibri" w:hAnsi="Calibri" w:cs="Calibri"/>
+        </w:rPr>
       </w:pPr>
       <w:bookmarkStart w:id="5" w:name="n8n-workflow-orchestrator"/>
       <w:r>
+        <w:rPr>
+          <w:rFonts w:ascii="Calibri" w:hAnsi="Calibri" w:cs="Calibri"/>
+        </w:rPr>
         <w:t>2.1 n8n (Workflow Orchestrator)</w:t>
       </w:r>
     </w:p>
@@ -390,15 +549,22 @@
           <w:ilvl w:val="0"/>
           <w:numId w:val="2"/>
         </w:numPr>
-      </w:pPr>
-      <w:r>
-        <w:rPr>
+        <w:rPr>
+          <w:rFonts w:ascii="Calibri" w:hAnsi="Calibri" w:cs="Calibri"/>
+        </w:rPr>
+      </w:pPr>
+      <w:r>
+        <w:rPr>
+          <w:rFonts w:ascii="Calibri" w:hAnsi="Calibri" w:cs="Calibri"/>
           <w:b/>
           <w:bCs/>
         </w:rPr>
         <w:t>Role:</w:t>
       </w:r>
       <w:r>
+        <w:rPr>
+          <w:rFonts w:ascii="Calibri" w:hAnsi="Calibri" w:cs="Calibri"/>
+        </w:rPr>
         <w:t xml:space="preserve"> Main execution engine orchestrating API logic and background workers.</w:t>
       </w:r>
     </w:p>
@@ -409,60 +575,87 @@
           <w:ilvl w:val="0"/>
           <w:numId w:val="2"/>
         </w:numPr>
-      </w:pPr>
-      <w:r>
-        <w:rPr>
+        <w:rPr>
+          <w:rFonts w:ascii="Calibri" w:hAnsi="Calibri" w:cs="Calibri"/>
+        </w:rPr>
+      </w:pPr>
+      <w:r>
+        <w:rPr>
+          <w:rFonts w:ascii="Calibri" w:hAnsi="Calibri" w:cs="Calibri"/>
           <w:b/>
           <w:bCs/>
         </w:rPr>
         <w:t>Dockerfile / Build:</w:t>
       </w:r>
       <w:r>
+        <w:rPr>
+          <w:rFonts w:ascii="Calibri" w:hAnsi="Calibri" w:cs="Calibri"/>
+        </w:rPr>
         <w:t xml:space="preserve"> Extends the official Alpine/Node image. It is heavily customized to install </w:t>
       </w:r>
       <w:r>
         <w:rPr>
           <w:rStyle w:val="VerbatimChar"/>
+          <w:rFonts w:ascii="Calibri" w:hAnsi="Calibri" w:cs="Calibri"/>
         </w:rPr>
         <w:t>python3</w:t>
       </w:r>
       <w:r>
+        <w:rPr>
+          <w:rFonts w:ascii="Calibri" w:hAnsi="Calibri" w:cs="Calibri"/>
+        </w:rPr>
         <w:t xml:space="preserve">, </w:t>
       </w:r>
       <w:r>
         <w:rPr>
           <w:rStyle w:val="VerbatimChar"/>
+          <w:rFonts w:ascii="Calibri" w:hAnsi="Calibri" w:cs="Calibri"/>
         </w:rPr>
         <w:t>poppler-utils</w:t>
       </w:r>
       <w:r>
+        <w:rPr>
+          <w:rFonts w:ascii="Calibri" w:hAnsi="Calibri" w:cs="Calibri"/>
+        </w:rPr>
         <w:t xml:space="preserve"> (</w:t>
       </w:r>
       <w:r>
         <w:rPr>
           <w:rStyle w:val="VerbatimChar"/>
+          <w:rFonts w:ascii="Calibri" w:hAnsi="Calibri" w:cs="Calibri"/>
         </w:rPr>
         <w:t>pdftoppm</w:t>
       </w:r>
       <w:r>
+        <w:rPr>
+          <w:rFonts w:ascii="Calibri" w:hAnsi="Calibri" w:cs="Calibri"/>
+        </w:rPr>
         <w:t xml:space="preserve">), </w:t>
       </w:r>
       <w:r>
         <w:rPr>
           <w:rStyle w:val="VerbatimChar"/>
+          <w:rFonts w:ascii="Calibri" w:hAnsi="Calibri" w:cs="Calibri"/>
         </w:rPr>
         <w:t>libreoffice</w:t>
       </w:r>
       <w:r>
+        <w:rPr>
+          <w:rFonts w:ascii="Calibri" w:hAnsi="Calibri" w:cs="Calibri"/>
+        </w:rPr>
         <w:t xml:space="preserve">, and </w:t>
       </w:r>
       <w:r>
         <w:rPr>
           <w:rStyle w:val="VerbatimChar"/>
+          <w:rFonts w:ascii="Calibri" w:hAnsi="Calibri" w:cs="Calibri"/>
         </w:rPr>
         <w:t>openjdk11</w:t>
       </w:r>
       <w:r>
+        <w:rPr>
+          <w:rFonts w:ascii="Calibri" w:hAnsi="Calibri" w:cs="Calibri"/>
+        </w:rPr>
         <w:t>. This allows the workflow to natively execute Python scripts, parse Excel rules, and convert DOCX/PPTX to PDF/Images immediately without external dependencies.</w:t>
       </w:r>
     </w:p>
@@ -473,24 +666,35 @@
           <w:ilvl w:val="0"/>
           <w:numId w:val="2"/>
         </w:numPr>
-      </w:pPr>
-      <w:r>
-        <w:rPr>
+        <w:rPr>
+          <w:rFonts w:ascii="Calibri" w:hAnsi="Calibri" w:cs="Calibri"/>
+        </w:rPr>
+      </w:pPr>
+      <w:r>
+        <w:rPr>
+          <w:rFonts w:ascii="Calibri" w:hAnsi="Calibri" w:cs="Calibri"/>
           <w:b/>
           <w:bCs/>
         </w:rPr>
         <w:t>Binary Handling:</w:t>
       </w:r>
       <w:r>
+        <w:rPr>
+          <w:rFonts w:ascii="Calibri" w:hAnsi="Calibri" w:cs="Calibri"/>
+        </w:rPr>
         <w:t xml:space="preserve"> Configured with </w:t>
       </w:r>
       <w:r>
         <w:rPr>
           <w:rStyle w:val="VerbatimChar"/>
+          <w:rFonts w:ascii="Calibri" w:hAnsi="Calibri" w:cs="Calibri"/>
         </w:rPr>
         <w:t>N8N_DEFAULT_BINARY_DATA_MODE=filesystem</w:t>
       </w:r>
       <w:r>
+        <w:rPr>
+          <w:rFonts w:ascii="Calibri" w:hAnsi="Calibri" w:cs="Calibri"/>
+        </w:rPr>
         <w:t xml:space="preserve"> to prevent database bloat, cleanly streaming binaries to memory or isolated disk volumes.</w:t>
       </w:r>
     </w:p>
@@ -501,20 +705,28 @@
           <w:ilvl w:val="0"/>
           <w:numId w:val="2"/>
         </w:numPr>
-      </w:pPr>
-      <w:r>
-        <w:rPr>
+        <w:rPr>
+          <w:rFonts w:ascii="Calibri" w:hAnsi="Calibri" w:cs="Calibri"/>
+        </w:rPr>
+      </w:pPr>
+      <w:r>
+        <w:rPr>
+          <w:rFonts w:ascii="Calibri" w:hAnsi="Calibri" w:cs="Calibri"/>
           <w:b/>
           <w:bCs/>
         </w:rPr>
         <w:t>Ports:</w:t>
       </w:r>
       <w:r>
+        <w:rPr>
+          <w:rFonts w:ascii="Calibri" w:hAnsi="Calibri" w:cs="Calibri"/>
+        </w:rPr>
         <w:t xml:space="preserve"> </w:t>
       </w:r>
       <w:r>
         <w:rPr>
           <w:rStyle w:val="VerbatimChar"/>
+          <w:rFonts w:ascii="Calibri" w:hAnsi="Calibri" w:cs="Calibri"/>
         </w:rPr>
         <w:t>5678</w:t>
       </w:r>
@@ -522,10 +734,16 @@
     <w:p>
       <w:pPr>
         <w:pStyle w:val="Heading3"/>
+        <w:rPr>
+          <w:rFonts w:ascii="Calibri" w:hAnsi="Calibri" w:cs="Calibri"/>
+        </w:rPr>
       </w:pPr>
       <w:bookmarkStart w:id="6" w:name="qdrant-targeted-vector-database"/>
       <w:bookmarkEnd w:id="5"/>
       <w:r>
+        <w:rPr>
+          <w:rFonts w:ascii="Calibri" w:hAnsi="Calibri" w:cs="Calibri"/>
+        </w:rPr>
         <w:t>2.2 Qdrant (Targeted Vector Database)</w:t>
       </w:r>
     </w:p>
@@ -536,15 +754,22 @@
           <w:ilvl w:val="0"/>
           <w:numId w:val="3"/>
         </w:numPr>
-      </w:pPr>
-      <w:r>
-        <w:rPr>
+        <w:rPr>
+          <w:rFonts w:ascii="Calibri" w:hAnsi="Calibri" w:cs="Calibri"/>
+        </w:rPr>
+      </w:pPr>
+      <w:r>
+        <w:rPr>
+          <w:rFonts w:ascii="Calibri" w:hAnsi="Calibri" w:cs="Calibri"/>
           <w:b/>
           <w:bCs/>
         </w:rPr>
         <w:t>Role:</w:t>
       </w:r>
       <w:r>
+        <w:rPr>
+          <w:rFonts w:ascii="Calibri" w:hAnsi="Calibri" w:cs="Calibri"/>
+        </w:rPr>
         <w:t xml:space="preserve"> High-performance vector search engine for the Knowledge Base.</w:t>
       </w:r>
     </w:p>
@@ -555,24 +780,35 @@
           <w:ilvl w:val="0"/>
           <w:numId w:val="3"/>
         </w:numPr>
-      </w:pPr>
-      <w:r>
-        <w:rPr>
+        <w:rPr>
+          <w:rFonts w:ascii="Calibri" w:hAnsi="Calibri" w:cs="Calibri"/>
+        </w:rPr>
+      </w:pPr>
+      <w:r>
+        <w:rPr>
+          <w:rFonts w:ascii="Calibri" w:hAnsi="Calibri" w:cs="Calibri"/>
           <w:b/>
           <w:bCs/>
         </w:rPr>
         <w:t>Container Details:</w:t>
       </w:r>
       <w:r>
+        <w:rPr>
+          <w:rFonts w:ascii="Calibri" w:hAnsi="Calibri" w:cs="Calibri"/>
+        </w:rPr>
         <w:t xml:space="preserve"> Utilizes </w:t>
       </w:r>
       <w:r>
         <w:rPr>
           <w:rStyle w:val="VerbatimChar"/>
+          <w:rFonts w:ascii="Calibri" w:hAnsi="Calibri" w:cs="Calibri"/>
         </w:rPr>
         <w:t>qdrant/qdrant:latest</w:t>
       </w:r>
       <w:r>
+        <w:rPr>
+          <w:rFonts w:ascii="Calibri" w:hAnsi="Calibri" w:cs="Calibri"/>
+        </w:rPr>
         <w:t xml:space="preserve"> operating natively via Docker volumes.</w:t>
       </w:r>
     </w:p>
@@ -583,15 +819,22 @@
           <w:ilvl w:val="0"/>
           <w:numId w:val="3"/>
         </w:numPr>
-      </w:pPr>
-      <w:r>
-        <w:rPr>
+        <w:rPr>
+          <w:rFonts w:ascii="Calibri" w:hAnsi="Calibri" w:cs="Calibri"/>
+        </w:rPr>
+      </w:pPr>
+      <w:r>
+        <w:rPr>
+          <w:rFonts w:ascii="Calibri" w:hAnsi="Calibri" w:cs="Calibri"/>
           <w:b/>
           <w:bCs/>
         </w:rPr>
         <w:t>Configuration:</w:t>
       </w:r>
       <w:r>
+        <w:rPr>
+          <w:rFonts w:ascii="Calibri" w:hAnsi="Calibri" w:cs="Calibri"/>
+        </w:rPr>
         <w:t xml:space="preserve"> Operates on 768-dimensional embeddings formatted by our chosen text models. Designed to answer multi-dimensional similarity mapping queries.</w:t>
       </w:r>
     </w:p>
@@ -602,44 +845,64 @@
           <w:ilvl w:val="0"/>
           <w:numId w:val="3"/>
         </w:numPr>
-      </w:pPr>
-      <w:r>
-        <w:rPr>
+        <w:rPr>
+          <w:rFonts w:ascii="Calibri" w:hAnsi="Calibri" w:cs="Calibri"/>
+        </w:rPr>
+      </w:pPr>
+      <w:r>
+        <w:rPr>
+          <w:rFonts w:ascii="Calibri" w:hAnsi="Calibri" w:cs="Calibri"/>
           <w:b/>
           <w:bCs/>
         </w:rPr>
         <w:t>Ports:</w:t>
       </w:r>
       <w:r>
+        <w:rPr>
+          <w:rFonts w:ascii="Calibri" w:hAnsi="Calibri" w:cs="Calibri"/>
+        </w:rPr>
         <w:t xml:space="preserve"> Exposes </w:t>
       </w:r>
       <w:r>
         <w:rPr>
           <w:rStyle w:val="VerbatimChar"/>
+          <w:rFonts w:ascii="Calibri" w:hAnsi="Calibri" w:cs="Calibri"/>
         </w:rPr>
         <w:t>6333</w:t>
       </w:r>
       <w:r>
+        <w:rPr>
+          <w:rFonts w:ascii="Calibri" w:hAnsi="Calibri" w:cs="Calibri"/>
+        </w:rPr>
         <w:t xml:space="preserve"> for REST payload execution and </w:t>
       </w:r>
       <w:r>
         <w:rPr>
           <w:rStyle w:val="VerbatimChar"/>
+          <w:rFonts w:ascii="Calibri" w:hAnsi="Calibri" w:cs="Calibri"/>
         </w:rPr>
         <w:t>6334</w:t>
       </w:r>
       <w:r>
+        <w:rPr>
+          <w:rFonts w:ascii="Calibri" w:hAnsi="Calibri" w:cs="Calibri"/>
+        </w:rPr>
         <w:t xml:space="preserve"> for internal gRPC configuration.</w:t>
       </w:r>
     </w:p>
     <w:p>
       <w:pPr>
         <w:pStyle w:val="Heading3"/>
+        <w:rPr>
+          <w:rFonts w:ascii="Calibri" w:hAnsi="Calibri" w:cs="Calibri"/>
+        </w:rPr>
       </w:pPr>
       <w:bookmarkStart w:id="7" w:name="florence-ai-vision-ocr-sidecar"/>
       <w:bookmarkEnd w:id="6"/>
       <w:r>
-        <w:lastRenderedPageBreak/>
+        <w:rPr>
+          <w:rFonts w:ascii="Calibri" w:hAnsi="Calibri" w:cs="Calibri"/>
+        </w:rPr>
         <w:t>2.3 Florence AI (Vision &amp; OCR Sidecar)</w:t>
       </w:r>
     </w:p>
@@ -650,15 +913,22 @@
           <w:ilvl w:val="0"/>
           <w:numId w:val="4"/>
         </w:numPr>
-      </w:pPr>
-      <w:r>
-        <w:rPr>
+        <w:rPr>
+          <w:rFonts w:ascii="Calibri" w:hAnsi="Calibri" w:cs="Calibri"/>
+        </w:rPr>
+      </w:pPr>
+      <w:r>
+        <w:rPr>
+          <w:rFonts w:ascii="Calibri" w:hAnsi="Calibri" w:cs="Calibri"/>
           <w:b/>
           <w:bCs/>
         </w:rPr>
         <w:t>Role:</w:t>
       </w:r>
       <w:r>
+        <w:rPr>
+          <w:rFonts w:ascii="Calibri" w:hAnsi="Calibri" w:cs="Calibri"/>
+        </w:rPr>
         <w:t xml:space="preserve"> Dedicated visual model resolving diagram layouts and processing dense document OCR.</w:t>
       </w:r>
     </w:p>
@@ -669,69 +939,101 @@
           <w:ilvl w:val="0"/>
           <w:numId w:val="4"/>
         </w:numPr>
-      </w:pPr>
-      <w:r>
-        <w:rPr>
-          <w:b/>
-          <w:bCs/>
-        </w:rPr>
+        <w:rPr>
+          <w:rFonts w:ascii="Calibri" w:hAnsi="Calibri" w:cs="Calibri"/>
+        </w:rPr>
+      </w:pPr>
+      <w:r>
+        <w:rPr>
+          <w:rFonts w:ascii="Calibri" w:hAnsi="Calibri" w:cs="Calibri"/>
+          <w:b/>
+          <w:bCs/>
+        </w:rPr>
+        <w:lastRenderedPageBreak/>
         <w:t>Dockerfile / Build:</w:t>
       </w:r>
       <w:r>
+        <w:rPr>
+          <w:rFonts w:ascii="Calibri" w:hAnsi="Calibri" w:cs="Calibri"/>
+        </w:rPr>
         <w:t xml:space="preserve"> A custom Docker build located in </w:t>
       </w:r>
       <w:r>
         <w:rPr>
           <w:rStyle w:val="VerbatimChar"/>
+          <w:rFonts w:ascii="Calibri" w:hAnsi="Calibri" w:cs="Calibri"/>
         </w:rPr>
         <w:t>./florence-service</w:t>
       </w:r>
       <w:r>
+        <w:rPr>
+          <w:rFonts w:ascii="Calibri" w:hAnsi="Calibri" w:cs="Calibri"/>
+        </w:rPr>
         <w:t xml:space="preserve">. Utilizes a </w:t>
       </w:r>
       <w:r>
         <w:rPr>
           <w:rStyle w:val="VerbatimChar"/>
+          <w:rFonts w:ascii="Calibri" w:hAnsi="Calibri" w:cs="Calibri"/>
         </w:rPr>
         <w:t>python:3.10-slim</w:t>
       </w:r>
       <w:r>
+        <w:rPr>
+          <w:rFonts w:ascii="Calibri" w:hAnsi="Calibri" w:cs="Calibri"/>
+        </w:rPr>
         <w:t xml:space="preserve"> base, natively installing </w:t>
       </w:r>
       <w:r>
         <w:rPr>
           <w:rStyle w:val="VerbatimChar"/>
+          <w:rFonts w:ascii="Calibri" w:hAnsi="Calibri" w:cs="Calibri"/>
         </w:rPr>
         <w:t>PyTorch</w:t>
       </w:r>
       <w:r>
+        <w:rPr>
+          <w:rFonts w:ascii="Calibri" w:hAnsi="Calibri" w:cs="Calibri"/>
+        </w:rPr>
         <w:t xml:space="preserve">, </w:t>
       </w:r>
       <w:r>
         <w:rPr>
           <w:rStyle w:val="VerbatimChar"/>
+          <w:rFonts w:ascii="Calibri" w:hAnsi="Calibri" w:cs="Calibri"/>
         </w:rPr>
         <w:t>flash_attn</w:t>
       </w:r>
       <w:r>
+        <w:rPr>
+          <w:rFonts w:ascii="Calibri" w:hAnsi="Calibri" w:cs="Calibri"/>
+        </w:rPr>
         <w:t xml:space="preserve">, and Azure-compatible CUDA dependencies. Wraps Microsoft’s </w:t>
       </w:r>
       <w:r>
         <w:rPr>
           <w:rStyle w:val="VerbatimChar"/>
+          <w:rFonts w:ascii="Calibri" w:hAnsi="Calibri" w:cs="Calibri"/>
         </w:rPr>
         <w:t>Florence-2-large-ft</w:t>
       </w:r>
       <w:r>
+        <w:rPr>
+          <w:rFonts w:ascii="Calibri" w:hAnsi="Calibri" w:cs="Calibri"/>
+        </w:rPr>
         <w:t xml:space="preserve"> within a lightweight Flask API (</w:t>
       </w:r>
       <w:r>
         <w:rPr>
           <w:rStyle w:val="VerbatimChar"/>
+          <w:rFonts w:ascii="Calibri" w:hAnsi="Calibri" w:cs="Calibri"/>
         </w:rPr>
         <w:t>app.py</w:t>
       </w:r>
       <w:r>
+        <w:rPr>
+          <w:rFonts w:ascii="Calibri" w:hAnsi="Calibri" w:cs="Calibri"/>
+        </w:rPr>
         <w:t>).</w:t>
       </w:r>
     </w:p>
@@ -742,24 +1044,35 @@
           <w:ilvl w:val="0"/>
           <w:numId w:val="4"/>
         </w:numPr>
-      </w:pPr>
-      <w:r>
-        <w:rPr>
+        <w:rPr>
+          <w:rFonts w:ascii="Calibri" w:hAnsi="Calibri" w:cs="Calibri"/>
+        </w:rPr>
+      </w:pPr>
+      <w:r>
+        <w:rPr>
+          <w:rFonts w:ascii="Calibri" w:hAnsi="Calibri" w:cs="Calibri"/>
           <w:b/>
           <w:bCs/>
         </w:rPr>
         <w:t>GPU Interface:</w:t>
       </w:r>
       <w:r>
+        <w:rPr>
+          <w:rFonts w:ascii="Calibri" w:hAnsi="Calibri" w:cs="Calibri"/>
+        </w:rPr>
         <w:t xml:space="preserve"> Provisions 1 NVIDIA GPU logic exclusively via Docker </w:t>
       </w:r>
       <w:r>
         <w:rPr>
           <w:rStyle w:val="VerbatimChar"/>
+          <w:rFonts w:ascii="Calibri" w:hAnsi="Calibri" w:cs="Calibri"/>
         </w:rPr>
         <w:t>deploy.resources.reservations</w:t>
       </w:r>
       <w:r>
+        <w:rPr>
+          <w:rFonts w:ascii="Calibri" w:hAnsi="Calibri" w:cs="Calibri"/>
+        </w:rPr>
         <w:t>.</w:t>
       </w:r>
     </w:p>
@@ -770,24 +1083,35 @@
           <w:ilvl w:val="0"/>
           <w:numId w:val="4"/>
         </w:numPr>
-      </w:pPr>
-      <w:r>
-        <w:rPr>
+        <w:rPr>
+          <w:rFonts w:ascii="Calibri" w:hAnsi="Calibri" w:cs="Calibri"/>
+        </w:rPr>
+      </w:pPr>
+      <w:r>
+        <w:rPr>
+          <w:rFonts w:ascii="Calibri" w:hAnsi="Calibri" w:cs="Calibri"/>
           <w:b/>
           <w:bCs/>
         </w:rPr>
         <w:t>Integration:</w:t>
       </w:r>
       <w:r>
+        <w:rPr>
+          <w:rFonts w:ascii="Calibri" w:hAnsi="Calibri" w:cs="Calibri"/>
+        </w:rPr>
         <w:t xml:space="preserve"> Avoids HTTP base64 payload limitations by natively sharing a mounted volume (</w:t>
       </w:r>
       <w:r>
         <w:rPr>
           <w:rStyle w:val="VerbatimChar"/>
+          <w:rFonts w:ascii="Calibri" w:hAnsi="Calibri" w:cs="Calibri"/>
         </w:rPr>
         <w:t>/tmp/n8n_processing</w:t>
       </w:r>
       <w:r>
+        <w:rPr>
+          <w:rFonts w:ascii="Calibri" w:hAnsi="Calibri" w:cs="Calibri"/>
+        </w:rPr>
         <w:t>) with n8n.</w:t>
       </w:r>
     </w:p>
@@ -798,20 +1122,28 @@
           <w:ilvl w:val="0"/>
           <w:numId w:val="4"/>
         </w:numPr>
-      </w:pPr>
-      <w:r>
-        <w:rPr>
+        <w:rPr>
+          <w:rFonts w:ascii="Calibri" w:hAnsi="Calibri" w:cs="Calibri"/>
+        </w:rPr>
+      </w:pPr>
+      <w:r>
+        <w:rPr>
+          <w:rFonts w:ascii="Calibri" w:hAnsi="Calibri" w:cs="Calibri"/>
           <w:b/>
           <w:bCs/>
         </w:rPr>
         <w:t>Ports:</w:t>
       </w:r>
       <w:r>
+        <w:rPr>
+          <w:rFonts w:ascii="Calibri" w:hAnsi="Calibri" w:cs="Calibri"/>
+        </w:rPr>
         <w:t xml:space="preserve"> </w:t>
       </w:r>
       <w:r>
         <w:rPr>
           <w:rStyle w:val="VerbatimChar"/>
+          <w:rFonts w:ascii="Calibri" w:hAnsi="Calibri" w:cs="Calibri"/>
         </w:rPr>
         <w:t>5000</w:t>
       </w:r>
@@ -819,10 +1151,16 @@
     <w:p>
       <w:pPr>
         <w:pStyle w:val="Heading3"/>
+        <w:rPr>
+          <w:rFonts w:ascii="Calibri" w:hAnsi="Calibri" w:cs="Calibri"/>
+        </w:rPr>
       </w:pPr>
       <w:bookmarkStart w:id="8" w:name="ollama-ai-llm-embedding-engine"/>
       <w:bookmarkEnd w:id="7"/>
       <w:r>
+        <w:rPr>
+          <w:rFonts w:ascii="Calibri" w:hAnsi="Calibri" w:cs="Calibri"/>
+        </w:rPr>
         <w:t>2.4 Ollama (AI LLM &amp; Embedding Engine)</w:t>
       </w:r>
     </w:p>
@@ -833,33 +1171,48 @@
           <w:ilvl w:val="0"/>
           <w:numId w:val="5"/>
         </w:numPr>
-      </w:pPr>
-      <w:r>
-        <w:rPr>
+        <w:rPr>
+          <w:rFonts w:ascii="Calibri" w:hAnsi="Calibri" w:cs="Calibri"/>
+        </w:rPr>
+      </w:pPr>
+      <w:r>
+        <w:rPr>
+          <w:rFonts w:ascii="Calibri" w:hAnsi="Calibri" w:cs="Calibri"/>
           <w:b/>
           <w:bCs/>
         </w:rPr>
         <w:t>Role:</w:t>
       </w:r>
       <w:r>
+        <w:rPr>
+          <w:rFonts w:ascii="Calibri" w:hAnsi="Calibri" w:cs="Calibri"/>
+        </w:rPr>
         <w:t xml:space="preserve"> Standalone provider for Local Language Inference (</w:t>
       </w:r>
       <w:r>
         <w:rPr>
           <w:rStyle w:val="VerbatimChar"/>
+          <w:rFonts w:ascii="Calibri" w:hAnsi="Calibri" w:cs="Calibri"/>
         </w:rPr>
         <w:t>Mistral Nemo 12B</w:t>
       </w:r>
       <w:r>
+        <w:rPr>
+          <w:rFonts w:ascii="Calibri" w:hAnsi="Calibri" w:cs="Calibri"/>
+        </w:rPr>
         <w:t>) and Vector Embedding generation (</w:t>
       </w:r>
       <w:r>
         <w:rPr>
           <w:rStyle w:val="VerbatimChar"/>
+          <w:rFonts w:ascii="Calibri" w:hAnsi="Calibri" w:cs="Calibri"/>
         </w:rPr>
         <w:t>nomic-embed-text</w:t>
       </w:r>
       <w:r>
+        <w:rPr>
+          <w:rFonts w:ascii="Calibri" w:hAnsi="Calibri" w:cs="Calibri"/>
+        </w:rPr>
         <w:t>).</w:t>
       </w:r>
     </w:p>
@@ -870,24 +1223,35 @@
           <w:ilvl w:val="0"/>
           <w:numId w:val="5"/>
         </w:numPr>
-      </w:pPr>
-      <w:r>
-        <w:rPr>
+        <w:rPr>
+          <w:rFonts w:ascii="Calibri" w:hAnsi="Calibri" w:cs="Calibri"/>
+        </w:rPr>
+      </w:pPr>
+      <w:r>
+        <w:rPr>
+          <w:rFonts w:ascii="Calibri" w:hAnsi="Calibri" w:cs="Calibri"/>
           <w:b/>
           <w:bCs/>
         </w:rPr>
         <w:t>Container Details:</w:t>
       </w:r>
       <w:r>
+        <w:rPr>
+          <w:rFonts w:ascii="Calibri" w:hAnsi="Calibri" w:cs="Calibri"/>
+        </w:rPr>
         <w:t xml:space="preserve"> Employs the </w:t>
       </w:r>
       <w:r>
         <w:rPr>
           <w:rStyle w:val="VerbatimChar"/>
+          <w:rFonts w:ascii="Calibri" w:hAnsi="Calibri" w:cs="Calibri"/>
         </w:rPr>
         <w:t>ollama/ollama:latest</w:t>
       </w:r>
       <w:r>
+        <w:rPr>
+          <w:rFonts w:ascii="Calibri" w:hAnsi="Calibri" w:cs="Calibri"/>
+        </w:rPr>
         <w:t xml:space="preserve"> distribution.</w:t>
       </w:r>
     </w:p>
@@ -898,24 +1262,35 @@
           <w:ilvl w:val="0"/>
           <w:numId w:val="5"/>
         </w:numPr>
-      </w:pPr>
-      <w:r>
-        <w:rPr>
+        <w:rPr>
+          <w:rFonts w:ascii="Calibri" w:hAnsi="Calibri" w:cs="Calibri"/>
+        </w:rPr>
+      </w:pPr>
+      <w:r>
+        <w:rPr>
+          <w:rFonts w:ascii="Calibri" w:hAnsi="Calibri" w:cs="Calibri"/>
           <w:b/>
           <w:bCs/>
         </w:rPr>
         <w:t>Initialization &amp; Scaling:</w:t>
       </w:r>
       <w:r>
+        <w:rPr>
+          <w:rFonts w:ascii="Calibri" w:hAnsi="Calibri" w:cs="Calibri"/>
+        </w:rPr>
         <w:t xml:space="preserve"> Features a specialized entrypoint script (</w:t>
       </w:r>
       <w:r>
         <w:rPr>
           <w:rStyle w:val="VerbatimChar"/>
+          <w:rFonts w:ascii="Calibri" w:hAnsi="Calibri" w:cs="Calibri"/>
         </w:rPr>
         <w:t>/bin/ollama serve &amp; sleep 5; /bin/ollama pull mistral-nemo:12b-instruct-2407-q4_K_M; ...</w:t>
       </w:r>
       <w:r>
+        <w:rPr>
+          <w:rFonts w:ascii="Calibri" w:hAnsi="Calibri" w:cs="Calibri"/>
+        </w:rPr>
         <w:t>) ensuring models are bootstrapped automatically upon container spin-up.</w:t>
       </w:r>
     </w:p>
@@ -926,33 +1301,48 @@
           <w:ilvl w:val="0"/>
           <w:numId w:val="5"/>
         </w:numPr>
-      </w:pPr>
-      <w:r>
-        <w:rPr>
+        <w:rPr>
+          <w:rFonts w:ascii="Calibri" w:hAnsi="Calibri" w:cs="Calibri"/>
+        </w:rPr>
+      </w:pPr>
+      <w:r>
+        <w:rPr>
+          <w:rFonts w:ascii="Calibri" w:hAnsi="Calibri" w:cs="Calibri"/>
           <w:b/>
           <w:bCs/>
         </w:rPr>
         <w:t>Hardware Profile:</w:t>
       </w:r>
       <w:r>
+        <w:rPr>
+          <w:rFonts w:ascii="Calibri" w:hAnsi="Calibri" w:cs="Calibri"/>
+        </w:rPr>
         <w:t xml:space="preserve"> Configured for unlimited tensor layers (</w:t>
       </w:r>
       <w:r>
         <w:rPr>
           <w:rStyle w:val="VerbatimChar"/>
+          <w:rFonts w:ascii="Calibri" w:hAnsi="Calibri" w:cs="Calibri"/>
         </w:rPr>
         <w:t>OLLAMA_GPU_LAYERS=999</w:t>
       </w:r>
       <w:r>
+        <w:rPr>
+          <w:rFonts w:ascii="Calibri" w:hAnsi="Calibri" w:cs="Calibri"/>
+        </w:rPr>
         <w:t xml:space="preserve">) across logical device </w:t>
       </w:r>
       <w:r>
         <w:rPr>
           <w:rStyle w:val="VerbatimChar"/>
+          <w:rFonts w:ascii="Calibri" w:hAnsi="Calibri" w:cs="Calibri"/>
         </w:rPr>
         <w:t>CUDA_VISIBLE_DEVICES=0</w:t>
       </w:r>
       <w:r>
+        <w:rPr>
+          <w:rFonts w:ascii="Calibri" w:hAnsi="Calibri" w:cs="Calibri"/>
+        </w:rPr>
         <w:t>.</w:t>
       </w:r>
     </w:p>
@@ -963,20 +1353,28 @@
           <w:ilvl w:val="0"/>
           <w:numId w:val="5"/>
         </w:numPr>
-      </w:pPr>
-      <w:r>
-        <w:rPr>
+        <w:rPr>
+          <w:rFonts w:ascii="Calibri" w:hAnsi="Calibri" w:cs="Calibri"/>
+        </w:rPr>
+      </w:pPr>
+      <w:r>
+        <w:rPr>
+          <w:rFonts w:ascii="Calibri" w:hAnsi="Calibri" w:cs="Calibri"/>
           <w:b/>
           <w:bCs/>
         </w:rPr>
         <w:t>Ports:</w:t>
       </w:r>
       <w:r>
+        <w:rPr>
+          <w:rFonts w:ascii="Calibri" w:hAnsi="Calibri" w:cs="Calibri"/>
+        </w:rPr>
         <w:t xml:space="preserve"> </w:t>
       </w:r>
       <w:r>
         <w:rPr>
           <w:rStyle w:val="VerbatimChar"/>
+          <w:rFonts w:ascii="Calibri" w:hAnsi="Calibri" w:cs="Calibri"/>
         </w:rPr>
         <w:t>11434</w:t>
       </w:r>
@@ -984,10 +1382,16 @@
     <w:p>
       <w:pPr>
         <w:pStyle w:val="Heading3"/>
+        <w:rPr>
+          <w:rFonts w:ascii="Calibri" w:hAnsi="Calibri" w:cs="Calibri"/>
+        </w:rPr>
       </w:pPr>
       <w:bookmarkStart w:id="9" w:name="postgresql-redis-database-queue"/>
       <w:bookmarkEnd w:id="8"/>
       <w:r>
+        <w:rPr>
+          <w:rFonts w:ascii="Calibri" w:hAnsi="Calibri" w:cs="Calibri"/>
+        </w:rPr>
         <w:t>2.5 PostgreSQL &amp; Redis (Database &amp; Queue)</w:t>
       </w:r>
     </w:p>
@@ -998,9 +1402,13 @@
           <w:ilvl w:val="0"/>
           <w:numId w:val="6"/>
         </w:numPr>
-      </w:pPr>
-      <w:r>
-        <w:rPr>
+        <w:rPr>
+          <w:rFonts w:ascii="Calibri" w:hAnsi="Calibri" w:cs="Calibri"/>
+        </w:rPr>
+      </w:pPr>
+      <w:r>
+        <w:rPr>
+          <w:rFonts w:ascii="Calibri" w:hAnsi="Calibri" w:cs="Calibri"/>
           <w:b/>
           <w:bCs/>
         </w:rPr>
@@ -1009,6 +1417,7 @@
       <w:r>
         <w:rPr>
           <w:rStyle w:val="VerbatimChar"/>
+          <w:rFonts w:ascii="Calibri" w:hAnsi="Calibri" w:cs="Calibri"/>
           <w:b/>
           <w:bCs/>
         </w:rPr>
@@ -1016,21 +1425,29 @@
       </w:r>
       <w:r>
         <w:rPr>
+          <w:rFonts w:ascii="Calibri" w:hAnsi="Calibri" w:cs="Calibri"/>
           <w:b/>
           <w:bCs/>
         </w:rPr>
         <w:t>):</w:t>
       </w:r>
       <w:r>
+        <w:rPr>
+          <w:rFonts w:ascii="Calibri" w:hAnsi="Calibri" w:cs="Calibri"/>
+        </w:rPr>
         <w:t xml:space="preserve"> Main database that stores audit sessions, logs, cached results, and evidence metadata. Auto-initializes schema on first startup using scripts in </w:t>
       </w:r>
       <w:r>
         <w:rPr>
           <w:rStyle w:val="VerbatimChar"/>
+          <w:rFonts w:ascii="Calibri" w:hAnsi="Calibri" w:cs="Calibri"/>
         </w:rPr>
         <w:t>docker-entrypoint-initdb.d</w:t>
       </w:r>
       <w:r>
+        <w:rPr>
+          <w:rFonts w:ascii="Calibri" w:hAnsi="Calibri" w:cs="Calibri"/>
+        </w:rPr>
         <w:t>.</w:t>
       </w:r>
     </w:p>
@@ -1041,9 +1458,13 @@
           <w:ilvl w:val="0"/>
           <w:numId w:val="6"/>
         </w:numPr>
-      </w:pPr>
-      <w:r>
-        <w:rPr>
+        <w:rPr>
+          <w:rFonts w:ascii="Calibri" w:hAnsi="Calibri" w:cs="Calibri"/>
+        </w:rPr>
+      </w:pPr>
+      <w:r>
+        <w:rPr>
+          <w:rFonts w:ascii="Calibri" w:hAnsi="Calibri" w:cs="Calibri"/>
           <w:b/>
           <w:bCs/>
         </w:rPr>
@@ -1052,6 +1473,7 @@
       <w:r>
         <w:rPr>
           <w:rStyle w:val="VerbatimChar"/>
+          <w:rFonts w:ascii="Calibri" w:hAnsi="Calibri" w:cs="Calibri"/>
           <w:b/>
           <w:bCs/>
         </w:rPr>
@@ -1059,12 +1481,16 @@
       </w:r>
       <w:r>
         <w:rPr>
+          <w:rFonts w:ascii="Calibri" w:hAnsi="Calibri" w:cs="Calibri"/>
           <w:b/>
           <w:bCs/>
         </w:rPr>
         <w:t>):</w:t>
       </w:r>
       <w:r>
+        <w:rPr>
+          <w:rFonts w:ascii="Calibri" w:hAnsi="Calibri" w:cs="Calibri"/>
+        </w:rPr>
         <w:t xml:space="preserve"> Job queue for async processing. Limited to 512MB RAM with LRU eviction to prevent memory issues during high load.</w:t>
       </w:r>
     </w:p>
@@ -1075,57 +1501,89 @@
           <w:ilvl w:val="0"/>
           <w:numId w:val="6"/>
         </w:numPr>
-      </w:pPr>
-      <w:r>
-        <w:rPr>
+        <w:rPr>
+          <w:rFonts w:ascii="Calibri" w:hAnsi="Calibri" w:cs="Calibri"/>
+        </w:rPr>
+      </w:pPr>
+      <w:r>
+        <w:rPr>
+          <w:rFonts w:ascii="Calibri" w:hAnsi="Calibri" w:cs="Calibri"/>
           <w:b/>
           <w:bCs/>
         </w:rPr>
         <w:t>Ports:</w:t>
       </w:r>
       <w:r>
+        <w:rPr>
+          <w:rFonts w:ascii="Calibri" w:hAnsi="Calibri" w:cs="Calibri"/>
+        </w:rPr>
         <w:t xml:space="preserve"> Postgres </w:t>
       </w:r>
       <w:r>
         <w:rPr>
           <w:rStyle w:val="VerbatimChar"/>
+          <w:rFonts w:ascii="Calibri" w:hAnsi="Calibri" w:cs="Calibri"/>
         </w:rPr>
         <w:t>5432</w:t>
       </w:r>
       <w:r>
+        <w:rPr>
+          <w:rFonts w:ascii="Calibri" w:hAnsi="Calibri" w:cs="Calibri"/>
+        </w:rPr>
         <w:t xml:space="preserve">, Redis </w:t>
       </w:r>
       <w:r>
         <w:rPr>
           <w:rStyle w:val="VerbatimChar"/>
+          <w:rFonts w:ascii="Calibri" w:hAnsi="Calibri" w:cs="Calibri"/>
         </w:rPr>
         <w:t>6379</w:t>
       </w:r>
     </w:p>
     <w:p>
-      <w:r>
+      <w:pPr>
+        <w:rPr>
+          <w:rFonts w:ascii="Calibri" w:hAnsi="Calibri" w:cs="Calibri"/>
+        </w:rPr>
+      </w:pPr>
+      <w:r>
+        <w:rPr>
+          <w:rFonts w:ascii="Calibri" w:hAnsi="Calibri" w:cs="Calibri"/>
+        </w:rPr>
         <w:pict w14:anchorId="074534F8">
-          <v:rect id="_x0000_i1242" style="width:0;height:1.5pt" o:hralign="center" o:hrstd="t" o:hr="t"/>
+          <v:rect id="_x0000_i1444" style="width:0;height:1.5pt" o:hralign="center" o:hrstd="t" o:hr="t"/>
         </w:pict>
       </w:r>
     </w:p>
     <w:p>
       <w:pPr>
         <w:pStyle w:val="Heading2"/>
+        <w:rPr>
+          <w:rFonts w:ascii="Calibri" w:hAnsi="Calibri" w:cs="Calibri"/>
+        </w:rPr>
       </w:pPr>
       <w:bookmarkStart w:id="10" w:name="infrastructure-deployment-strategy"/>
       <w:bookmarkEnd w:id="4"/>
       <w:bookmarkEnd w:id="9"/>
       <w:r>
+        <w:rPr>
+          <w:rFonts w:ascii="Calibri" w:hAnsi="Calibri" w:cs="Calibri"/>
+        </w:rPr>
         <w:t>3. Infrastructure &amp; Deployment Strategy</w:t>
       </w:r>
     </w:p>
     <w:p>
       <w:pPr>
         <w:pStyle w:val="Heading3"/>
+        <w:rPr>
+          <w:rFonts w:ascii="Calibri" w:hAnsi="Calibri" w:cs="Calibri"/>
+        </w:rPr>
       </w:pPr>
       <w:bookmarkStart w:id="11" w:name="azure-environment"/>
       <w:r>
+        <w:rPr>
+          <w:rFonts w:ascii="Calibri" w:hAnsi="Calibri" w:cs="Calibri"/>
+        </w:rPr>
         <w:t>3.1 Azure Environment</w:t>
       </w:r>
     </w:p>
@@ -1136,16 +1594,35 @@
           <w:ilvl w:val="0"/>
           <w:numId w:val="7"/>
         </w:numPr>
-      </w:pPr>
-      <w:r>
-        <w:rPr>
+        <w:rPr>
+          <w:rFonts w:ascii="Calibri" w:hAnsi="Calibri" w:cs="Calibri"/>
+        </w:rPr>
+      </w:pPr>
+      <w:r>
+        <w:rPr>
+          <w:rFonts w:ascii="Calibri" w:hAnsi="Calibri" w:cs="Calibri"/>
           <w:b/>
           <w:bCs/>
         </w:rPr>
         <w:t>VM:</w:t>
       </w:r>
       <w:r>
-        <w:t xml:space="preserve"> Everything runs on a single Azure NV36ads A10 v5 instance. Keeping it all on one machine reduces latency and simplifies security. You need to install Azure GRID vGPU drivers for the NVIDIA GPU to work properly in Docker.</w:t>
+        <w:rPr>
+          <w:rFonts w:ascii="Calibri" w:hAnsi="Calibri" w:cs="Calibri"/>
+        </w:rPr>
+        <w:t xml:space="preserve"> Everything runs on a single Azure NV36ads A10 v5 instance. Keeping it all on one machine reduces latency and simplifies security. </w:t>
+      </w:r>
+      <w:r>
+        <w:rPr>
+          <w:rFonts w:ascii="Calibri" w:hAnsi="Calibri" w:cs="Calibri"/>
+        </w:rPr>
+        <w:t>We</w:t>
+      </w:r>
+      <w:r>
+        <w:rPr>
+          <w:rFonts w:ascii="Calibri" w:hAnsi="Calibri" w:cs="Calibri"/>
+        </w:rPr>
+        <w:t xml:space="preserve"> need to install Azure GRID vGPU drivers for the NVIDIA GPU to work properly in Docker.</w:t>
       </w:r>
     </w:p>
     <w:p>
@@ -1155,25 +1632,35 @@
           <w:ilvl w:val="0"/>
           <w:numId w:val="7"/>
         </w:numPr>
-      </w:pPr>
-      <w:r>
-        <w:rPr>
-          <w:b/>
-          <w:bCs/>
-        </w:rPr>
-        <w:lastRenderedPageBreak/>
+        <w:rPr>
+          <w:rFonts w:ascii="Calibri" w:hAnsi="Calibri" w:cs="Calibri"/>
+        </w:rPr>
+      </w:pPr>
+      <w:r>
+        <w:rPr>
+          <w:rFonts w:ascii="Calibri" w:hAnsi="Calibri" w:cs="Calibri"/>
+          <w:b/>
+          <w:bCs/>
+        </w:rPr>
         <w:t>Blob Storage:</w:t>
       </w:r>
       <w:r>
+        <w:rPr>
+          <w:rFonts w:ascii="Calibri" w:hAnsi="Calibri" w:cs="Calibri"/>
+        </w:rPr>
         <w:t xml:space="preserve"> Azure Blob Storage account </w:t>
       </w:r>
       <w:r>
         <w:rPr>
           <w:rStyle w:val="VerbatimChar"/>
+          <w:rFonts w:ascii="Calibri" w:hAnsi="Calibri" w:cs="Calibri"/>
         </w:rPr>
         <w:t>stcompdldevqc01</w:t>
       </w:r>
       <w:r>
+        <w:rPr>
+          <w:rFonts w:ascii="Calibri" w:hAnsi="Calibri" w:cs="Calibri"/>
+        </w:rPr>
         <w:t xml:space="preserve"> stores uploaded evidence files and compliance templates.</w:t>
       </w:r>
     </w:p>
@@ -1184,122 +1671,286 @@
           <w:ilvl w:val="0"/>
           <w:numId w:val="7"/>
         </w:numPr>
-      </w:pPr>
-      <w:r>
-        <w:rPr>
+        <w:rPr>
+          <w:rFonts w:ascii="Calibri" w:hAnsi="Calibri" w:cs="Calibri"/>
+        </w:rPr>
+      </w:pPr>
+      <w:r>
+        <w:rPr>
+          <w:rFonts w:ascii="Calibri" w:hAnsi="Calibri" w:cs="Calibri"/>
           <w:b/>
           <w:bCs/>
         </w:rPr>
         <w:t>External Database:</w:t>
       </w:r>
       <w:r>
+        <w:rPr>
+          <w:rFonts w:ascii="Calibri" w:hAnsi="Calibri" w:cs="Calibri"/>
+        </w:rPr>
         <w:t xml:space="preserve"> There’s a separate read-only Azure PostgreSQL instance that we sync compliance domains and questions from.</w:t>
       </w:r>
     </w:p>
     <w:p>
       <w:pPr>
         <w:pStyle w:val="Heading3"/>
+        <w:rPr>
+          <w:rFonts w:ascii="Calibri" w:hAnsi="Calibri" w:cs="Calibri"/>
+        </w:rPr>
       </w:pPr>
       <w:bookmarkStart w:id="12" w:name="docker-volumes"/>
       <w:bookmarkEnd w:id="11"/>
       <w:r>
+        <w:rPr>
+          <w:rFonts w:ascii="Calibri" w:hAnsi="Calibri" w:cs="Calibri"/>
+        </w:rPr>
+        <w:lastRenderedPageBreak/>
         <w:t>3.2 Docker Volumes</w:t>
       </w:r>
     </w:p>
     <w:p>
       <w:pPr>
         <w:pStyle w:val="FirstParagraph"/>
-      </w:pPr>
-      <w:r>
-        <w:t xml:space="preserve">All the important data is stored in Docker volumes so it survives container restarts: - </w:t>
-      </w:r>
-      <w:r>
-        <w:rPr>
-          <w:rStyle w:val="VerbatimChar"/>
+        <w:rPr>
+          <w:rFonts w:ascii="Calibri" w:hAnsi="Calibri" w:cs="Calibri"/>
+        </w:rPr>
+      </w:pPr>
+      <w:r>
+        <w:rPr>
+          <w:rFonts w:ascii="Calibri" w:hAnsi="Calibri" w:cs="Calibri"/>
+        </w:rPr>
+        <w:t xml:space="preserve">All the important data is stored in Docker </w:t>
+      </w:r>
+      <w:r>
+        <w:rPr>
+          <w:rFonts w:ascii="Calibri" w:hAnsi="Calibri" w:cs="Calibri"/>
+        </w:rPr>
+        <w:t>volumes,</w:t>
+      </w:r>
+      <w:r>
+        <w:rPr>
+          <w:rFonts w:ascii="Calibri" w:hAnsi="Calibri" w:cs="Calibri"/>
+        </w:rPr>
+        <w:t xml:space="preserve"> so it survives container restarts: </w:t>
+      </w:r>
+    </w:p>
+    <w:p>
+      <w:pPr>
+        <w:pStyle w:val="FirstParagraph"/>
+        <w:rPr>
+          <w:rFonts w:ascii="Calibri" w:hAnsi="Calibri" w:cs="Calibri"/>
+        </w:rPr>
+      </w:pPr>
+      <w:r>
+        <w:rPr>
+          <w:rFonts w:ascii="Calibri" w:hAnsi="Calibri" w:cs="Calibri"/>
+        </w:rPr>
+        <w:t xml:space="preserve">- </w:t>
+      </w:r>
+      <w:r>
+        <w:rPr>
+          <w:rStyle w:val="VerbatimChar"/>
+          <w:rFonts w:ascii="Calibri" w:hAnsi="Calibri" w:cs="Calibri"/>
         </w:rPr>
         <w:t>n8n_data</w:t>
       </w:r>
       <w:r>
-        <w:t xml:space="preserve">: Workflow data and execution history - </w:t>
-      </w:r>
-      <w:r>
-        <w:rPr>
-          <w:rStyle w:val="VerbatimChar"/>
+        <w:rPr>
+          <w:rFonts w:ascii="Calibri" w:hAnsi="Calibri" w:cs="Calibri"/>
+        </w:rPr>
+        <w:t xml:space="preserve">: Workflow data and execution history </w:t>
+      </w:r>
+    </w:p>
+    <w:p>
+      <w:pPr>
+        <w:pStyle w:val="FirstParagraph"/>
+        <w:rPr>
+          <w:rFonts w:ascii="Calibri" w:hAnsi="Calibri" w:cs="Calibri"/>
+        </w:rPr>
+      </w:pPr>
+      <w:r>
+        <w:rPr>
+          <w:rFonts w:ascii="Calibri" w:hAnsi="Calibri" w:cs="Calibri"/>
+        </w:rPr>
+        <w:t xml:space="preserve">- </w:t>
+      </w:r>
+      <w:r>
+        <w:rPr>
+          <w:rStyle w:val="VerbatimChar"/>
+          <w:rFonts w:ascii="Calibri" w:hAnsi="Calibri" w:cs="Calibri"/>
         </w:rPr>
         <w:t>postgres_data</w:t>
       </w:r>
       <w:r>
-        <w:t xml:space="preserve">: Database tables - </w:t>
-      </w:r>
-      <w:r>
-        <w:rPr>
-          <w:rStyle w:val="VerbatimChar"/>
+        <w:rPr>
+          <w:rFonts w:ascii="Calibri" w:hAnsi="Calibri" w:cs="Calibri"/>
+        </w:rPr>
+        <w:t xml:space="preserve">: Database tables </w:t>
+      </w:r>
+    </w:p>
+    <w:p>
+      <w:pPr>
+        <w:pStyle w:val="FirstParagraph"/>
+        <w:rPr>
+          <w:rFonts w:ascii="Calibri" w:hAnsi="Calibri" w:cs="Calibri"/>
+        </w:rPr>
+      </w:pPr>
+      <w:r>
+        <w:rPr>
+          <w:rFonts w:ascii="Calibri" w:hAnsi="Calibri" w:cs="Calibri"/>
+        </w:rPr>
+        <w:t xml:space="preserve">- </w:t>
+      </w:r>
+      <w:r>
+        <w:rPr>
+          <w:rStyle w:val="VerbatimChar"/>
+          <w:rFonts w:ascii="Calibri" w:hAnsi="Calibri" w:cs="Calibri"/>
         </w:rPr>
         <w:t>qdrant_storage</w:t>
       </w:r>
       <w:r>
-        <w:t xml:space="preserve">: Vector embeddings - </w:t>
-      </w:r>
-      <w:r>
-        <w:rPr>
-          <w:rStyle w:val="VerbatimChar"/>
+        <w:rPr>
+          <w:rFonts w:ascii="Calibri" w:hAnsi="Calibri" w:cs="Calibri"/>
+        </w:rPr>
+        <w:t xml:space="preserve">: Vector embeddings </w:t>
+      </w:r>
+    </w:p>
+    <w:p>
+      <w:pPr>
+        <w:pStyle w:val="FirstParagraph"/>
+        <w:rPr>
+          <w:rFonts w:ascii="Calibri" w:hAnsi="Calibri" w:cs="Calibri"/>
+        </w:rPr>
+      </w:pPr>
+      <w:r>
+        <w:rPr>
+          <w:rFonts w:ascii="Calibri" w:hAnsi="Calibri" w:cs="Calibri"/>
+        </w:rPr>
+        <w:t xml:space="preserve">- </w:t>
+      </w:r>
+      <w:r>
+        <w:rPr>
+          <w:rStyle w:val="VerbatimChar"/>
+          <w:rFonts w:ascii="Calibri" w:hAnsi="Calibri" w:cs="Calibri"/>
         </w:rPr>
         <w:t>redis_data</w:t>
       </w:r>
       <w:r>
-        <w:t xml:space="preserve">: Unfinished jobs in the queue - </w:t>
-      </w:r>
-      <w:r>
-        <w:rPr>
-          <w:rStyle w:val="VerbatimChar"/>
+        <w:rPr>
+          <w:rFonts w:ascii="Calibri" w:hAnsi="Calibri" w:cs="Calibri"/>
+        </w:rPr>
+        <w:t xml:space="preserve">: Unfinished jobs in the queue </w:t>
+      </w:r>
+    </w:p>
+    <w:p>
+      <w:pPr>
+        <w:pStyle w:val="FirstParagraph"/>
+        <w:rPr>
+          <w:rFonts w:ascii="Calibri" w:hAnsi="Calibri" w:cs="Calibri"/>
+        </w:rPr>
+      </w:pPr>
+      <w:r>
+        <w:rPr>
+          <w:rFonts w:ascii="Calibri" w:hAnsi="Calibri" w:cs="Calibri"/>
+        </w:rPr>
+        <w:t xml:space="preserve">- </w:t>
+      </w:r>
+      <w:r>
+        <w:rPr>
+          <w:rStyle w:val="VerbatimChar"/>
+          <w:rFonts w:ascii="Calibri" w:hAnsi="Calibri" w:cs="Calibri"/>
         </w:rPr>
         <w:t>ollama_data</w:t>
       </w:r>
       <w:r>
+        <w:rPr>
+          <w:rFonts w:ascii="Calibri" w:hAnsi="Calibri" w:cs="Calibri"/>
+        </w:rPr>
         <w:t xml:space="preserve"> &amp; </w:t>
       </w:r>
       <w:r>
         <w:rPr>
           <w:rStyle w:val="VerbatimChar"/>
+          <w:rFonts w:ascii="Calibri" w:hAnsi="Calibri" w:cs="Calibri"/>
         </w:rPr>
         <w:t>hf_model_cache</w:t>
       </w:r>
       <w:r>
-        <w:t xml:space="preserve">: AI models (15GB+) so we don’t have to re-download them every time - </w:t>
-      </w:r>
-      <w:r>
-        <w:rPr>
-          <w:rStyle w:val="VerbatimChar"/>
+        <w:rPr>
+          <w:rFonts w:ascii="Calibri" w:hAnsi="Calibri" w:cs="Calibri"/>
+        </w:rPr>
+        <w:t xml:space="preserve">: AI models (15GB+) so we don’t have to re-download them every time </w:t>
+      </w:r>
+    </w:p>
+    <w:p>
+      <w:pPr>
+        <w:pStyle w:val="FirstParagraph"/>
+        <w:rPr>
+          <w:rFonts w:ascii="Calibri" w:hAnsi="Calibri" w:cs="Calibri"/>
+        </w:rPr>
+      </w:pPr>
+      <w:r>
+        <w:rPr>
+          <w:rFonts w:ascii="Calibri" w:hAnsi="Calibri" w:cs="Calibri"/>
+        </w:rPr>
+        <w:t xml:space="preserve">- </w:t>
+      </w:r>
+      <w:r>
+        <w:rPr>
+          <w:rStyle w:val="VerbatimChar"/>
+          <w:rFonts w:ascii="Calibri" w:hAnsi="Calibri" w:cs="Calibri"/>
         </w:rPr>
         <w:t>shared_processing</w:t>
       </w:r>
       <w:r>
+        <w:rPr>
+          <w:rFonts w:ascii="Calibri" w:hAnsi="Calibri" w:cs="Calibri"/>
+        </w:rPr>
         <w:t>: Temporary folder for passing files between n8n and Florence without using HTTP</w:t>
       </w:r>
     </w:p>
     <w:p>
-      <w:r>
+      <w:pPr>
+        <w:rPr>
+          <w:rFonts w:ascii="Calibri" w:hAnsi="Calibri" w:cs="Calibri"/>
+        </w:rPr>
+      </w:pPr>
+      <w:r>
+        <w:rPr>
+          <w:rFonts w:ascii="Calibri" w:hAnsi="Calibri" w:cs="Calibri"/>
+        </w:rPr>
         <w:pict w14:anchorId="050DC2C6">
-          <v:rect id="_x0000_i1243" style="width:0;height:1.5pt" o:hralign="center" o:hrstd="t" o:hr="t"/>
+          <v:rect id="_x0000_i1445" style="width:0;height:1.5pt" o:hralign="center" o:hrstd="t" o:hr="t"/>
         </w:pict>
       </w:r>
     </w:p>
     <w:p>
       <w:pPr>
         <w:pStyle w:val="Heading2"/>
+        <w:rPr>
+          <w:rFonts w:ascii="Calibri" w:hAnsi="Calibri" w:cs="Calibri"/>
+        </w:rPr>
       </w:pPr>
       <w:bookmarkStart w:id="13" w:name="workflow-definitions"/>
       <w:bookmarkEnd w:id="10"/>
       <w:bookmarkEnd w:id="12"/>
       <w:r>
+        <w:rPr>
+          <w:rFonts w:ascii="Calibri" w:hAnsi="Calibri" w:cs="Calibri"/>
+        </w:rPr>
         <w:t>4. Workflow Definitions</w:t>
       </w:r>
     </w:p>
     <w:p>
       <w:pPr>
         <w:pStyle w:val="FirstParagraph"/>
-      </w:pPr>
-      <w:r>
+        <w:rPr>
+          <w:rFonts w:ascii="Calibri" w:hAnsi="Calibri" w:cs="Calibri"/>
+        </w:rPr>
+      </w:pPr>
+      <w:r>
+        <w:rPr>
+          <w:rFonts w:ascii="Calibri" w:hAnsi="Calibri" w:cs="Calibri"/>
+        </w:rPr>
         <w:t>The system has 6 workflows that handle different parts of the process:</w:t>
       </w:r>
     </w:p>
@@ -1309,24 +1960,35 @@
           <w:ilvl w:val="0"/>
           <w:numId w:val="8"/>
         </w:numPr>
-      </w:pPr>
-      <w:r>
-        <w:rPr>
+        <w:rPr>
+          <w:rFonts w:ascii="Calibri" w:hAnsi="Calibri" w:cs="Calibri"/>
+        </w:rPr>
+      </w:pPr>
+      <w:r>
+        <w:rPr>
+          <w:rFonts w:ascii="Calibri" w:hAnsi="Calibri" w:cs="Calibri"/>
           <w:b/>
           <w:bCs/>
         </w:rPr>
         <w:t>Workflow A - Universal Extractor</w:t>
       </w:r>
       <w:r>
+        <w:rPr>
+          <w:rFonts w:ascii="Calibri" w:hAnsi="Calibri" w:cs="Calibri"/>
+        </w:rPr>
         <w:t xml:space="preserve"> (</w:t>
       </w:r>
       <w:r>
         <w:rPr>
           <w:rStyle w:val="VerbatimChar"/>
+          <w:rFonts w:ascii="Calibri" w:hAnsi="Calibri" w:cs="Calibri"/>
         </w:rPr>
         <w:t>/webhook/extract</w:t>
       </w:r>
       <w:r>
+        <w:rPr>
+          <w:rFonts w:ascii="Calibri" w:hAnsi="Calibri" w:cs="Calibri"/>
+        </w:rPr>
         <w:t>) Takes any document (PDF, DOCX, PPTX, XLSX) and extracts text and images. Sends images to Florence-2 for OCR and visual analysis.</w:t>
       </w:r>
     </w:p>
@@ -1336,24 +1998,35 @@
           <w:ilvl w:val="0"/>
           <w:numId w:val="8"/>
         </w:numPr>
-      </w:pPr>
-      <w:r>
-        <w:rPr>
+        <w:rPr>
+          <w:rFonts w:ascii="Calibri" w:hAnsi="Calibri" w:cs="Calibri"/>
+        </w:rPr>
+      </w:pPr>
+      <w:r>
+        <w:rPr>
+          <w:rFonts w:ascii="Calibri" w:hAnsi="Calibri" w:cs="Calibri"/>
           <w:b/>
           <w:bCs/>
         </w:rPr>
         <w:t>Workflow B - KB Ingestion</w:t>
       </w:r>
       <w:r>
+        <w:rPr>
+          <w:rFonts w:ascii="Calibri" w:hAnsi="Calibri" w:cs="Calibri"/>
+        </w:rPr>
         <w:t xml:space="preserve"> (</w:t>
       </w:r>
       <w:r>
         <w:rPr>
           <w:rStyle w:val="VerbatimChar"/>
+          <w:rFonts w:ascii="Calibri" w:hAnsi="Calibri" w:cs="Calibri"/>
         </w:rPr>
         <w:t>/webhook/kb/ingest</w:t>
       </w:r>
       <w:r>
+        <w:rPr>
+          <w:rFonts w:ascii="Calibri" w:hAnsi="Calibri" w:cs="Calibri"/>
+        </w:rPr>
         <w:t>) Breaks compliance documents into chunks (1000 words with 200 word overlap), generates SHA-256 hashes to avoid duplicates, creates embeddings, and stores them in Qdrant.</w:t>
       </w:r>
     </w:p>
@@ -1363,24 +2036,35 @@
           <w:ilvl w:val="0"/>
           <w:numId w:val="8"/>
         </w:numPr>
-      </w:pPr>
-      <w:r>
-        <w:rPr>
+        <w:rPr>
+          <w:rFonts w:ascii="Calibri" w:hAnsi="Calibri" w:cs="Calibri"/>
+        </w:rPr>
+      </w:pPr>
+      <w:r>
+        <w:rPr>
+          <w:rFonts w:ascii="Calibri" w:hAnsi="Calibri" w:cs="Calibri"/>
           <w:b/>
           <w:bCs/>
         </w:rPr>
         <w:t>Workflow C1 - Audit Entry</w:t>
       </w:r>
       <w:r>
+        <w:rPr>
+          <w:rFonts w:ascii="Calibri" w:hAnsi="Calibri" w:cs="Calibri"/>
+        </w:rPr>
         <w:t xml:space="preserve"> (</w:t>
       </w:r>
       <w:r>
         <w:rPr>
           <w:rStyle w:val="VerbatimChar"/>
+          <w:rFonts w:ascii="Calibri" w:hAnsi="Calibri" w:cs="Calibri"/>
         </w:rPr>
         <w:t>/webhook/audit/submit</w:t>
       </w:r>
       <w:r>
+        <w:rPr>
+          <w:rFonts w:ascii="Calibri" w:hAnsi="Calibri" w:cs="Calibri"/>
+        </w:rPr>
         <w:t>) Receives audit requests, saves them to Postgres, validates that files exist in Azure Blob Storage, adds jobs to Redis queue, and immediately returns a session ID with HTTP 202.</w:t>
       </w:r>
     </w:p>
@@ -1390,15 +2074,22 @@
           <w:ilvl w:val="0"/>
           <w:numId w:val="8"/>
         </w:numPr>
-      </w:pPr>
-      <w:r>
-        <w:rPr>
+        <w:rPr>
+          <w:rFonts w:ascii="Calibri" w:hAnsi="Calibri" w:cs="Calibri"/>
+        </w:rPr>
+      </w:pPr>
+      <w:r>
+        <w:rPr>
+          <w:rFonts w:ascii="Calibri" w:hAnsi="Calibri" w:cs="Calibri"/>
           <w:b/>
           <w:bCs/>
         </w:rPr>
         <w:t>Workflow C2 - Audit Worker</w:t>
       </w:r>
       <w:r>
+        <w:rPr>
+          <w:rFonts w:ascii="Calibri" w:hAnsi="Calibri" w:cs="Calibri"/>
+        </w:rPr>
         <w:t xml:space="preserve"> (runs on schedule) Pulls jobs from Redis, checks the cache, extracts relevant text from evidence files, searches Qdrant for similar compliance documents, and uses Mistral to generate compliance scores.</w:t>
       </w:r>
     </w:p>
@@ -1408,24 +2099,35 @@
           <w:ilvl w:val="0"/>
           <w:numId w:val="8"/>
         </w:numPr>
-      </w:pPr>
-      <w:r>
-        <w:rPr>
+        <w:rPr>
+          <w:rFonts w:ascii="Calibri" w:hAnsi="Calibri" w:cs="Calibri"/>
+        </w:rPr>
+      </w:pPr>
+      <w:r>
+        <w:rPr>
+          <w:rFonts w:ascii="Calibri" w:hAnsi="Calibri" w:cs="Calibri"/>
           <w:b/>
           <w:bCs/>
         </w:rPr>
         <w:t>Workflow C3 - Status Poll</w:t>
       </w:r>
       <w:r>
+        <w:rPr>
+          <w:rFonts w:ascii="Calibri" w:hAnsi="Calibri" w:cs="Calibri"/>
+        </w:rPr>
         <w:t xml:space="preserve"> (</w:t>
       </w:r>
       <w:r>
         <w:rPr>
           <w:rStyle w:val="VerbatimChar"/>
+          <w:rFonts w:ascii="Calibri" w:hAnsi="Calibri" w:cs="Calibri"/>
         </w:rPr>
         <w:t>/webhook/audit/status/:sessionId</w:t>
       </w:r>
       <w:r>
+        <w:rPr>
+          <w:rFonts w:ascii="Calibri" w:hAnsi="Calibri" w:cs="Calibri"/>
+        </w:rPr>
         <w:t>) Returns current progress for each audit question in a session.</w:t>
       </w:r>
     </w:p>
@@ -1435,41 +2137,66 @@
           <w:ilvl w:val="0"/>
           <w:numId w:val="8"/>
         </w:numPr>
-      </w:pPr>
-      <w:r>
-        <w:rPr>
+        <w:rPr>
+          <w:rFonts w:ascii="Calibri" w:hAnsi="Calibri" w:cs="Calibri"/>
+        </w:rPr>
+      </w:pPr>
+      <w:r>
+        <w:rPr>
+          <w:rFonts w:ascii="Calibri" w:hAnsi="Calibri" w:cs="Calibri"/>
           <w:b/>
           <w:bCs/>
         </w:rPr>
         <w:t>Workflow C4 - Results Retrieval</w:t>
       </w:r>
       <w:r>
+        <w:rPr>
+          <w:rFonts w:ascii="Calibri" w:hAnsi="Calibri" w:cs="Calibri"/>
+        </w:rPr>
         <w:t xml:space="preserve"> (</w:t>
       </w:r>
       <w:r>
         <w:rPr>
           <w:rStyle w:val="VerbatimChar"/>
+          <w:rFonts w:ascii="Calibri" w:hAnsi="Calibri" w:cs="Calibri"/>
         </w:rPr>
         <w:t>/webhook/audit/results/:sessionId</w:t>
       </w:r>
       <w:r>
+        <w:rPr>
+          <w:rFonts w:ascii="Calibri" w:hAnsi="Calibri" w:cs="Calibri"/>
+        </w:rPr>
         <w:t>) Returns the final compliance report with scores, gaps, and recommendations.</w:t>
       </w:r>
     </w:p>
     <w:p>
-      <w:r>
+      <w:pPr>
+        <w:rPr>
+          <w:rFonts w:ascii="Calibri" w:hAnsi="Calibri" w:cs="Calibri"/>
+        </w:rPr>
+      </w:pPr>
+      <w:r>
+        <w:rPr>
+          <w:rFonts w:ascii="Calibri" w:hAnsi="Calibri" w:cs="Calibri"/>
+        </w:rPr>
         <w:pict w14:anchorId="7BF5CDA3">
-          <v:rect id="_x0000_i1244" style="width:0;height:1.5pt" o:hralign="center" o:hrstd="t" o:hr="t"/>
+          <v:rect id="_x0000_i1446" style="width:0;height:1.5pt" o:hralign="center" o:hrstd="t" o:hr="t"/>
         </w:pict>
       </w:r>
     </w:p>
     <w:p>
       <w:pPr>
         <w:pStyle w:val="Heading2"/>
+        <w:rPr>
+          <w:rFonts w:ascii="Calibri" w:hAnsi="Calibri" w:cs="Calibri"/>
+        </w:rPr>
       </w:pPr>
       <w:bookmarkStart w:id="14" w:name="data-storage-model"/>
       <w:bookmarkEnd w:id="13"/>
       <w:r>
+        <w:rPr>
+          <w:rFonts w:ascii="Calibri" w:hAnsi="Calibri" w:cs="Calibri"/>
+        </w:rPr>
         <w:lastRenderedPageBreak/>
         <w:t>5. Data &amp; Storage Model</w:t>
       </w:r>
@@ -1477,117 +2204,175 @@
     <w:p>
       <w:pPr>
         <w:pStyle w:val="Heading3"/>
+        <w:rPr>
+          <w:rFonts w:ascii="Calibri" w:hAnsi="Calibri" w:cs="Calibri"/>
+        </w:rPr>
       </w:pPr>
       <w:bookmarkStart w:id="15" w:name="postgresql-compliance_db"/>
       <w:r>
+        <w:rPr>
+          <w:rFonts w:ascii="Calibri" w:hAnsi="Calibri" w:cs="Calibri"/>
+        </w:rPr>
         <w:t>5.1 PostgreSQL (compliance_db)</w:t>
       </w:r>
     </w:p>
     <w:p>
       <w:pPr>
         <w:pStyle w:val="FirstParagraph"/>
-      </w:pPr>
-      <w:r>
+        <w:rPr>
+          <w:rFonts w:ascii="Calibri" w:hAnsi="Calibri" w:cs="Calibri"/>
+        </w:rPr>
+      </w:pPr>
+      <w:r>
+        <w:rPr>
+          <w:rFonts w:ascii="Calibri" w:hAnsi="Calibri" w:cs="Calibri"/>
+        </w:rPr>
         <w:t xml:space="preserve">Main database with these tables: - </w:t>
       </w:r>
       <w:r>
         <w:rPr>
           <w:rStyle w:val="VerbatimChar"/>
+          <w:rFonts w:ascii="Calibri" w:hAnsi="Calibri" w:cs="Calibri"/>
         </w:rPr>
         <w:t>audit_domains</w:t>
       </w:r>
       <w:r>
+        <w:rPr>
+          <w:rFonts w:ascii="Calibri" w:hAnsi="Calibri" w:cs="Calibri"/>
+        </w:rPr>
         <w:t xml:space="preserve">, </w:t>
       </w:r>
       <w:r>
         <w:rPr>
           <w:rStyle w:val="VerbatimChar"/>
+          <w:rFonts w:ascii="Calibri" w:hAnsi="Calibri" w:cs="Calibri"/>
         </w:rPr>
         <w:t>audit_questions</w:t>
       </w:r>
       <w:r>
+        <w:rPr>
+          <w:rFonts w:ascii="Calibri" w:hAnsi="Calibri" w:cs="Calibri"/>
+        </w:rPr>
         <w:t xml:space="preserve">: Compliance domains and the questions for each one - </w:t>
       </w:r>
       <w:r>
         <w:rPr>
           <w:rStyle w:val="VerbatimChar"/>
+          <w:rFonts w:ascii="Calibri" w:hAnsi="Calibri" w:cs="Calibri"/>
         </w:rPr>
         <w:t>audit_evidence</w:t>
       </w:r>
       <w:r>
+        <w:rPr>
+          <w:rFonts w:ascii="Calibri" w:hAnsi="Calibri" w:cs="Calibri"/>
+        </w:rPr>
         <w:t xml:space="preserve">: Uploaded evidence files and their metadata - </w:t>
       </w:r>
       <w:r>
         <w:rPr>
           <w:rStyle w:val="VerbatimChar"/>
+          <w:rFonts w:ascii="Calibri" w:hAnsi="Calibri" w:cs="Calibri"/>
         </w:rPr>
         <w:t>audit_logs</w:t>
       </w:r>
       <w:r>
+        <w:rPr>
+          <w:rFonts w:ascii="Calibri" w:hAnsi="Calibri" w:cs="Calibri"/>
+        </w:rPr>
         <w:t xml:space="preserve">: Execution logs for debugging - </w:t>
       </w:r>
       <w:r>
         <w:rPr>
           <w:rStyle w:val="VerbatimChar"/>
+          <w:rFonts w:ascii="Calibri" w:hAnsi="Calibri" w:cs="Calibri"/>
         </w:rPr>
         <w:t>audit_sessions</w:t>
       </w:r>
       <w:r>
+        <w:rPr>
+          <w:rFonts w:ascii="Calibri" w:hAnsi="Calibri" w:cs="Calibri"/>
+        </w:rPr>
         <w:t>: Audit sessions with status (</w:t>
       </w:r>
       <w:r>
         <w:rPr>
           <w:rStyle w:val="VerbatimChar"/>
+          <w:rFonts w:ascii="Calibri" w:hAnsi="Calibri" w:cs="Calibri"/>
         </w:rPr>
         <w:t>pending</w:t>
       </w:r>
       <w:r>
+        <w:rPr>
+          <w:rFonts w:ascii="Calibri" w:hAnsi="Calibri" w:cs="Calibri"/>
+        </w:rPr>
         <w:t xml:space="preserve">, </w:t>
       </w:r>
       <w:r>
         <w:rPr>
           <w:rStyle w:val="VerbatimChar"/>
+          <w:rFonts w:ascii="Calibri" w:hAnsi="Calibri" w:cs="Calibri"/>
         </w:rPr>
         <w:t>processing</w:t>
       </w:r>
       <w:r>
+        <w:rPr>
+          <w:rFonts w:ascii="Calibri" w:hAnsi="Calibri" w:cs="Calibri"/>
+        </w:rPr>
         <w:t xml:space="preserve">, </w:t>
       </w:r>
       <w:r>
         <w:rPr>
           <w:rStyle w:val="VerbatimChar"/>
+          <w:rFonts w:ascii="Calibri" w:hAnsi="Calibri" w:cs="Calibri"/>
         </w:rPr>
         <w:t>completed</w:t>
       </w:r>
       <w:r>
+        <w:rPr>
+          <w:rFonts w:ascii="Calibri" w:hAnsi="Calibri" w:cs="Calibri"/>
+        </w:rPr>
         <w:t xml:space="preserve">, </w:t>
       </w:r>
       <w:r>
         <w:rPr>
           <w:rStyle w:val="VerbatimChar"/>
+          <w:rFonts w:ascii="Calibri" w:hAnsi="Calibri" w:cs="Calibri"/>
         </w:rPr>
         <w:t>failed</w:t>
       </w:r>
       <w:r>
+        <w:rPr>
+          <w:rFonts w:ascii="Calibri" w:hAnsi="Calibri" w:cs="Calibri"/>
+        </w:rPr>
         <w:t xml:space="preserve">) - </w:t>
       </w:r>
       <w:r>
         <w:rPr>
           <w:rStyle w:val="VerbatimChar"/>
+          <w:rFonts w:ascii="Calibri" w:hAnsi="Calibri" w:cs="Calibri"/>
         </w:rPr>
         <w:t>kb_standards</w:t>
       </w:r>
       <w:r>
+        <w:rPr>
+          <w:rFonts w:ascii="Calibri" w:hAnsi="Calibri" w:cs="Calibri"/>
+        </w:rPr>
         <w:t>: Compliance document chunks (deduplicated)</w:t>
       </w:r>
     </w:p>
     <w:p>
       <w:pPr>
         <w:pStyle w:val="Heading3"/>
+        <w:rPr>
+          <w:rFonts w:ascii="Calibri" w:hAnsi="Calibri" w:cs="Calibri"/>
+        </w:rPr>
       </w:pPr>
       <w:bookmarkStart w:id="16" w:name="azure-blob-storage"/>
       <w:bookmarkEnd w:id="15"/>
       <w:r>
+        <w:rPr>
+          <w:rFonts w:ascii="Calibri" w:hAnsi="Calibri" w:cs="Calibri"/>
+        </w:rPr>
         <w:t>5.2 Azure Blob Storage</w:t>
       </w:r>
     </w:p>
@@ -1598,20 +2383,28 @@
           <w:ilvl w:val="0"/>
           <w:numId w:val="9"/>
         </w:numPr>
-      </w:pPr>
-      <w:r>
-        <w:rPr>
+        <w:rPr>
+          <w:rFonts w:ascii="Calibri" w:hAnsi="Calibri" w:cs="Calibri"/>
+        </w:rPr>
+      </w:pPr>
+      <w:r>
+        <w:rPr>
+          <w:rFonts w:ascii="Calibri" w:hAnsi="Calibri" w:cs="Calibri"/>
           <w:b/>
           <w:bCs/>
         </w:rPr>
         <w:t>Account:</w:t>
       </w:r>
       <w:r>
+        <w:rPr>
+          <w:rFonts w:ascii="Calibri" w:hAnsi="Calibri" w:cs="Calibri"/>
+        </w:rPr>
         <w:t xml:space="preserve"> </w:t>
       </w:r>
       <w:r>
         <w:rPr>
           <w:rStyle w:val="VerbatimChar"/>
+          <w:rFonts w:ascii="Calibri" w:hAnsi="Calibri" w:cs="Calibri"/>
         </w:rPr>
         <w:t>stcompdldevqc01</w:t>
       </w:r>
@@ -1623,20 +2416,28 @@
           <w:ilvl w:val="0"/>
           <w:numId w:val="9"/>
         </w:numPr>
-      </w:pPr>
-      <w:r>
-        <w:rPr>
+        <w:rPr>
+          <w:rFonts w:ascii="Calibri" w:hAnsi="Calibri" w:cs="Calibri"/>
+        </w:rPr>
+      </w:pPr>
+      <w:r>
+        <w:rPr>
+          <w:rFonts w:ascii="Calibri" w:hAnsi="Calibri" w:cs="Calibri"/>
           <w:b/>
           <w:bCs/>
         </w:rPr>
         <w:t>Container:</w:t>
       </w:r>
       <w:r>
+        <w:rPr>
+          <w:rFonts w:ascii="Calibri" w:hAnsi="Calibri" w:cs="Calibri"/>
+        </w:rPr>
         <w:t xml:space="preserve"> </w:t>
       </w:r>
       <w:r>
         <w:rPr>
           <w:rStyle w:val="VerbatimChar"/>
+          <w:rFonts w:ascii="Calibri" w:hAnsi="Calibri" w:cs="Calibri"/>
         </w:rPr>
         <w:t>complianceblobdev</w:t>
       </w:r>
@@ -1648,54 +2449,87 @@
           <w:ilvl w:val="0"/>
           <w:numId w:val="9"/>
         </w:numPr>
-      </w:pPr>
-      <w:r>
+        <w:rPr>
+          <w:rFonts w:ascii="Calibri" w:hAnsi="Calibri" w:cs="Calibri"/>
+        </w:rPr>
+      </w:pPr>
+      <w:r>
+        <w:rPr>
+          <w:rFonts w:ascii="Calibri" w:hAnsi="Calibri" w:cs="Calibri"/>
+        </w:rPr>
         <w:t>Stores uploaded evidence files (</w:t>
       </w:r>
       <w:r>
         <w:rPr>
           <w:rStyle w:val="VerbatimChar"/>
+          <w:rFonts w:ascii="Calibri" w:hAnsi="Calibri" w:cs="Calibri"/>
         </w:rPr>
         <w:t>compliance_assessment/</w:t>
       </w:r>
       <w:r>
-        <w:t>), domain guidelines (</w:t>
-      </w:r>
-      <w:r>
-        <w:rPr>
-          <w:rStyle w:val="VerbatimChar"/>
-        </w:rPr>
-        <w:t>guidelines/</w:t>
-      </w:r>
-      <w:r>
-        <w:t>), and question templates. Access is controlled with short-lived SAS tokens.</w:t>
-      </w:r>
-    </w:p>
-    <w:p>
-      <w:r>
+        <w:rPr>
+          <w:rFonts w:ascii="Calibri" w:hAnsi="Calibri" w:cs="Calibri"/>
+        </w:rPr>
+        <w:t>)</w:t>
+      </w:r>
+      <w:r>
+        <w:rPr>
+          <w:rFonts w:ascii="Calibri" w:hAnsi="Calibri" w:cs="Calibri"/>
+        </w:rPr>
+        <w:t>and question templates. Access is controlled with short-lived SAS tokens.</w:t>
+      </w:r>
+    </w:p>
+    <w:p>
+      <w:pPr>
+        <w:rPr>
+          <w:rFonts w:ascii="Calibri" w:hAnsi="Calibri" w:cs="Calibri"/>
+        </w:rPr>
+      </w:pPr>
+      <w:r>
+        <w:rPr>
+          <w:rFonts w:ascii="Calibri" w:hAnsi="Calibri" w:cs="Calibri"/>
+        </w:rPr>
         <w:pict w14:anchorId="1FDEF0C2">
-          <v:rect id="_x0000_i1245" style="width:0;height:1.5pt" o:hralign="center" o:hrstd="t" o:hr="t"/>
+          <v:rect id="_x0000_i1447" style="width:0;height:1.5pt" o:hralign="center" o:hrstd="t" o:hr="t"/>
         </w:pict>
       </w:r>
     </w:p>
     <w:p>
       <w:pPr>
         <w:pStyle w:val="Heading2"/>
+        <w:rPr>
+          <w:rFonts w:ascii="Calibri" w:hAnsi="Calibri" w:cs="Calibri"/>
+        </w:rPr>
       </w:pPr>
       <w:bookmarkStart w:id="17" w:name="performance-processing-metrics"/>
       <w:bookmarkEnd w:id="14"/>
       <w:bookmarkEnd w:id="16"/>
       <w:r>
+        <w:rPr>
+          <w:rFonts w:ascii="Calibri" w:hAnsi="Calibri" w:cs="Calibri"/>
+        </w:rPr>
         <w:t>6. Performance &amp; Processing Metrics</w:t>
       </w:r>
     </w:p>
     <w:p>
       <w:pPr>
         <w:pStyle w:val="Heading3"/>
+        <w:rPr>
+          <w:rFonts w:ascii="Calibri" w:hAnsi="Calibri" w:cs="Calibri"/>
+        </w:rPr>
       </w:pPr>
       <w:bookmarkStart w:id="18" w:name="processing-speed"/>
       <w:r>
+        <w:rPr>
+          <w:rFonts w:ascii="Calibri" w:hAnsi="Calibri" w:cs="Calibri"/>
+        </w:rPr>
         <w:t>6.1 Processing Speed</w:t>
+      </w:r>
+      <w:r>
+        <w:rPr>
+          <w:rFonts w:ascii="Calibri" w:hAnsi="Calibri" w:cs="Calibri"/>
+        </w:rPr>
+        <w:t xml:space="preserve"> (Sample 4 Page PPTX file)</w:t>
       </w:r>
     </w:p>
     <w:p>
@@ -1705,15 +2539,22 @@
           <w:ilvl w:val="0"/>
           <w:numId w:val="10"/>
         </w:numPr>
-      </w:pPr>
-      <w:r>
-        <w:rPr>
+        <w:rPr>
+          <w:rFonts w:ascii="Calibri" w:hAnsi="Calibri" w:cs="Calibri"/>
+        </w:rPr>
+      </w:pPr>
+      <w:r>
+        <w:rPr>
+          <w:rFonts w:ascii="Calibri" w:hAnsi="Calibri" w:cs="Calibri"/>
           <w:b/>
           <w:bCs/>
         </w:rPr>
         <w:t>With GPU:</w:t>
       </w:r>
       <w:r>
+        <w:rPr>
+          <w:rFonts w:ascii="Calibri" w:hAnsi="Calibri" w:cs="Calibri"/>
+        </w:rPr>
         <w:t xml:space="preserve"> 17 seconds per file</w:t>
       </w:r>
     </w:p>
@@ -1724,15 +2565,22 @@
           <w:ilvl w:val="0"/>
           <w:numId w:val="10"/>
         </w:numPr>
-      </w:pPr>
-      <w:r>
-        <w:rPr>
+        <w:rPr>
+          <w:rFonts w:ascii="Calibri" w:hAnsi="Calibri" w:cs="Calibri"/>
+        </w:rPr>
+      </w:pPr>
+      <w:r>
+        <w:rPr>
+          <w:rFonts w:ascii="Calibri" w:hAnsi="Calibri" w:cs="Calibri"/>
           <w:b/>
           <w:bCs/>
         </w:rPr>
         <w:t>Without GPU:</w:t>
       </w:r>
       <w:r>
+        <w:rPr>
+          <w:rFonts w:ascii="Calibri" w:hAnsi="Calibri" w:cs="Calibri"/>
+        </w:rPr>
         <w:t xml:space="preserve"> 2 minutes 45 seconds per file</w:t>
       </w:r>
     </w:p>
@@ -1743,25 +2591,38 @@
           <w:ilvl w:val="0"/>
           <w:numId w:val="10"/>
         </w:numPr>
-      </w:pPr>
-      <w:r>
-        <w:rPr>
+        <w:rPr>
+          <w:rFonts w:ascii="Calibri" w:hAnsi="Calibri" w:cs="Calibri"/>
+        </w:rPr>
+      </w:pPr>
+      <w:r>
+        <w:rPr>
+          <w:rFonts w:ascii="Calibri" w:hAnsi="Calibri" w:cs="Calibri"/>
           <w:b/>
           <w:bCs/>
         </w:rPr>
         <w:t>Cache hit:</w:t>
       </w:r>
       <w:r>
+        <w:rPr>
+          <w:rFonts w:ascii="Calibri" w:hAnsi="Calibri" w:cs="Calibri"/>
+        </w:rPr>
         <w:t xml:space="preserve"> ~100ms (skips extraction, RAG search, and LLM evaluation by looking up the SHA-256 hash)</w:t>
       </w:r>
     </w:p>
     <w:p>
       <w:pPr>
         <w:pStyle w:val="Heading3"/>
+        <w:rPr>
+          <w:rFonts w:ascii="Calibri" w:hAnsi="Calibri" w:cs="Calibri"/>
+        </w:rPr>
       </w:pPr>
       <w:bookmarkStart w:id="19" w:name="gpu-usage-azure-nv36ads-a10-v5"/>
       <w:bookmarkEnd w:id="18"/>
       <w:r>
+        <w:rPr>
+          <w:rFonts w:ascii="Calibri" w:hAnsi="Calibri" w:cs="Calibri"/>
+        </w:rPr>
         <w:t>6.2 GPU Usage (Azure NV36ads A10 v5)</w:t>
       </w:r>
     </w:p>
@@ -1772,15 +2633,22 @@
           <w:ilvl w:val="0"/>
           <w:numId w:val="11"/>
         </w:numPr>
-      </w:pPr>
-      <w:r>
-        <w:rPr>
+        <w:rPr>
+          <w:rFonts w:ascii="Calibri" w:hAnsi="Calibri" w:cs="Calibri"/>
+        </w:rPr>
+      </w:pPr>
+      <w:r>
+        <w:rPr>
+          <w:rFonts w:ascii="Calibri" w:hAnsi="Calibri" w:cs="Calibri"/>
           <w:b/>
           <w:bCs/>
         </w:rPr>
         <w:t>Total VRAM:</w:t>
       </w:r>
       <w:r>
+        <w:rPr>
+          <w:rFonts w:ascii="Calibri" w:hAnsi="Calibri" w:cs="Calibri"/>
+        </w:rPr>
         <w:t xml:space="preserve"> 24 GB</w:t>
       </w:r>
     </w:p>
@@ -1791,33 +2659,54 @@
           <w:ilvl w:val="0"/>
           <w:numId w:val="11"/>
         </w:numPr>
-      </w:pPr>
-      <w:r>
-        <w:rPr>
+        <w:rPr>
+          <w:rFonts w:ascii="Calibri" w:hAnsi="Calibri" w:cs="Calibri"/>
+        </w:rPr>
+      </w:pPr>
+      <w:r>
+        <w:rPr>
+          <w:rFonts w:ascii="Calibri" w:hAnsi="Calibri" w:cs="Calibri"/>
           <w:b/>
           <w:bCs/>
         </w:rPr>
         <w:t>Used:</w:t>
       </w:r>
       <w:r>
+        <w:rPr>
+          <w:rFonts w:ascii="Calibri" w:hAnsi="Calibri" w:cs="Calibri"/>
+        </w:rPr>
         <w:t xml:space="preserve"> ~13.8 GB (Mistral 12B Q4_K_M + Florence-2 both fit comfortably)</w:t>
       </w:r>
     </w:p>
     <w:p>
-      <w:r>
+      <w:pPr>
+        <w:rPr>
+          <w:rFonts w:ascii="Calibri" w:hAnsi="Calibri" w:cs="Calibri"/>
+        </w:rPr>
+      </w:pPr>
+      <w:r>
+        <w:rPr>
+          <w:rFonts w:ascii="Calibri" w:hAnsi="Calibri" w:cs="Calibri"/>
+        </w:rPr>
         <w:pict w14:anchorId="46C716C5">
-          <v:rect id="_x0000_i1246" style="width:0;height:1.5pt" o:hralign="center" o:hrstd="t" o:hr="t"/>
+          <v:rect id="_x0000_i1448" style="width:0;height:1.5pt" o:hralign="center" o:hrstd="t" o:hr="t"/>
         </w:pict>
       </w:r>
     </w:p>
     <w:p>
       <w:pPr>
         <w:pStyle w:val="Heading2"/>
+        <w:rPr>
+          <w:rFonts w:ascii="Calibri" w:hAnsi="Calibri" w:cs="Calibri"/>
+        </w:rPr>
       </w:pPr>
       <w:bookmarkStart w:id="20" w:name="file-operations-security"/>
       <w:bookmarkEnd w:id="17"/>
       <w:bookmarkEnd w:id="19"/>
       <w:r>
+        <w:rPr>
+          <w:rFonts w:ascii="Calibri" w:hAnsi="Calibri" w:cs="Calibri"/>
+        </w:rPr>
         <w:t>7. File Operations &amp; Security</w:t>
       </w:r>
     </w:p>
@@ -1828,24 +2717,35 @@
           <w:ilvl w:val="0"/>
           <w:numId w:val="12"/>
         </w:numPr>
-      </w:pPr>
-      <w:r>
-        <w:rPr>
+        <w:rPr>
+          <w:rFonts w:ascii="Calibri" w:hAnsi="Calibri" w:cs="Calibri"/>
+        </w:rPr>
+      </w:pPr>
+      <w:r>
+        <w:rPr>
+          <w:rFonts w:ascii="Calibri" w:hAnsi="Calibri" w:cs="Calibri"/>
           <w:b/>
           <w:bCs/>
         </w:rPr>
         <w:t>Temp files:</w:t>
       </w:r>
       <w:r>
+        <w:rPr>
+          <w:rFonts w:ascii="Calibri" w:hAnsi="Calibri" w:cs="Calibri"/>
+        </w:rPr>
         <w:t xml:space="preserve"> Everything goes in </w:t>
       </w:r>
       <w:r>
         <w:rPr>
           <w:rStyle w:val="VerbatimChar"/>
+          <w:rFonts w:ascii="Calibri" w:hAnsi="Calibri" w:cs="Calibri"/>
         </w:rPr>
         <w:t>/tmp/n8n_processing/</w:t>
       </w:r>
       <w:r>
+        <w:rPr>
+          <w:rFonts w:ascii="Calibri" w:hAnsi="Calibri" w:cs="Calibri"/>
+        </w:rPr>
         <w:t xml:space="preserve"> and gets cleaned up automatically</w:t>
       </w:r>
     </w:p>
@@ -1856,24 +2756,35 @@
           <w:ilvl w:val="0"/>
           <w:numId w:val="12"/>
         </w:numPr>
-      </w:pPr>
-      <w:r>
-        <w:rPr>
+        <w:rPr>
+          <w:rFonts w:ascii="Calibri" w:hAnsi="Calibri" w:cs="Calibri"/>
+        </w:rPr>
+      </w:pPr>
+      <w:r>
+        <w:rPr>
+          <w:rFonts w:ascii="Calibri" w:hAnsi="Calibri" w:cs="Calibri"/>
           <w:b/>
           <w:bCs/>
         </w:rPr>
         <w:t>Concurrency:</w:t>
       </w:r>
       <w:r>
+        <w:rPr>
+          <w:rFonts w:ascii="Calibri" w:hAnsi="Calibri" w:cs="Calibri"/>
+        </w:rPr>
         <w:t xml:space="preserve"> No hardcoded filenames like </w:t>
       </w:r>
       <w:r>
         <w:rPr>
           <w:rStyle w:val="VerbatimChar"/>
+          <w:rFonts w:ascii="Calibri" w:hAnsi="Calibri" w:cs="Calibri"/>
         </w:rPr>
         <w:t>input.pdf</w:t>
       </w:r>
       <w:r>
+        <w:rPr>
+          <w:rFonts w:ascii="Calibri" w:hAnsi="Calibri" w:cs="Calibri"/>
+        </w:rPr>
         <w:t>. Every file gets a unique prefix to prevent collisions when processing multiple requests at once.</w:t>
       </w:r>
     </w:p>
@@ -1884,15 +2795,22 @@
           <w:ilvl w:val="0"/>
           <w:numId w:val="12"/>
         </w:numPr>
-      </w:pPr>
-      <w:r>
-        <w:rPr>
+        <w:rPr>
+          <w:rFonts w:ascii="Calibri" w:hAnsi="Calibri" w:cs="Calibri"/>
+        </w:rPr>
+      </w:pPr>
+      <w:r>
+        <w:rPr>
+          <w:rFonts w:ascii="Calibri" w:hAnsi="Calibri" w:cs="Calibri"/>
           <w:b/>
           <w:bCs/>
         </w:rPr>
         <w:t>Filename tracking:</w:t>
       </w:r>
       <w:r>
+        <w:rPr>
+          <w:rFonts w:ascii="Calibri" w:hAnsi="Calibri" w:cs="Calibri"/>
+        </w:rPr>
         <w:t xml:space="preserve"> We keep track of original filenames so the final report shows the actual file names users uploaded.</w:t>
       </w:r>
     </w:p>
@@ -1903,45 +2821,474 @@
           <w:ilvl w:val="0"/>
           <w:numId w:val="12"/>
         </w:numPr>
-      </w:pPr>
-      <w:r>
-        <w:rPr>
+        <w:rPr>
+          <w:rFonts w:ascii="Calibri" w:hAnsi="Calibri" w:cs="Calibri"/>
+        </w:rPr>
+      </w:pPr>
+      <w:r>
+        <w:rPr>
+          <w:rFonts w:ascii="Calibri" w:hAnsi="Calibri" w:cs="Calibri"/>
           <w:b/>
           <w:bCs/>
         </w:rPr>
         <w:t>Secrets:</w:t>
       </w:r>
       <w:r>
+        <w:rPr>
+          <w:rFonts w:ascii="Calibri" w:hAnsi="Calibri" w:cs="Calibri"/>
+        </w:rPr>
         <w:t xml:space="preserve"> All passwords, connection strings, and API keys are stored in environment variables, not in code.</w:t>
       </w:r>
     </w:p>
     <w:p>
-      <w:r>
+      <w:pPr>
+        <w:rPr>
+          <w:rFonts w:ascii="Calibri" w:hAnsi="Calibri" w:cs="Calibri"/>
+        </w:rPr>
+      </w:pPr>
+      <w:r>
+        <w:rPr>
+          <w:rFonts w:ascii="Calibri" w:hAnsi="Calibri" w:cs="Calibri"/>
+        </w:rPr>
         <w:pict w14:anchorId="5EC16AAB">
-          <v:rect id="_x0000_i1247" style="width:0;height:1.5pt" o:hralign="center" o:hrstd="t" o:hr="t"/>
+          <v:rect id="_x0000_i1449" style="width:0;height:1.5pt" o:hralign="center" o:hrstd="t" o:hr="t"/>
         </w:pict>
       </w:r>
     </w:p>
     <w:p>
       <w:pPr>
         <w:pStyle w:val="Heading2"/>
+        <w:rPr>
+          <w:rFonts w:ascii="Calibri" w:hAnsi="Calibri" w:cs="Calibri"/>
+        </w:rPr>
       </w:pPr>
       <w:bookmarkStart w:id="21" w:name="conclusion"/>
       <w:bookmarkEnd w:id="20"/>
       <w:r>
+        <w:rPr>
+          <w:rFonts w:ascii="Calibri" w:hAnsi="Calibri" w:cs="Calibri"/>
+        </w:rPr>
         <w:lastRenderedPageBreak/>
-        <w:t>8. Conclusion</w:t>
-      </w:r>
-    </w:p>
+        <w:t>8</w:t>
+      </w:r>
+      <w:r>
+        <w:rPr>
+          <w:rFonts w:ascii="Calibri" w:hAnsi="Calibri" w:cs="Calibri"/>
+        </w:rPr>
+        <w:t xml:space="preserve">. </w:t>
+      </w:r>
+      <w:r>
+        <w:rPr>
+          <w:rFonts w:ascii="Calibri" w:hAnsi="Calibri" w:cs="Calibri"/>
+        </w:rPr>
+        <w:t>References</w:t>
+      </w:r>
+    </w:p>
+    <w:p>
+      <w:pPr>
+        <w:pStyle w:val="BodyText"/>
+      </w:pPr>
+      <w:r>
+        <w:rPr>
+          <w:noProof/>
+        </w:rPr>
+        <w:drawing>
+          <wp:inline distT="0" distB="0" distL="0" distR="0" wp14:anchorId="2E1262FE" wp14:editId="1BF33B68">
+            <wp:extent cx="5943600" cy="2976880"/>
+            <wp:effectExtent l="0" t="0" r="0" b="0"/>
+            <wp:docPr id="1310029331" name="Picture 2"/>
+            <wp:cNvGraphicFramePr>
+              <a:graphicFrameLocks xmlns:a="http://schemas.openxmlformats.org/drawingml/2006/main" noChangeAspect="1"/>
+            </wp:cNvGraphicFramePr>
+            <a:graphic xmlns:a="http://schemas.openxmlformats.org/drawingml/2006/main">
+              <a:graphicData uri="http://schemas.openxmlformats.org/drawingml/2006/picture">
+                <pic:pic xmlns:pic="http://schemas.openxmlformats.org/drawingml/2006/picture">
+                  <pic:nvPicPr>
+                    <pic:cNvPr id="0" name="Picture 426"/>
+                    <pic:cNvPicPr>
+                      <a:picLocks noChangeAspect="1" noChangeArrowheads="1"/>
+                    </pic:cNvPicPr>
+                  </pic:nvPicPr>
+                  <pic:blipFill>
+                    <a:blip r:embed="rId7" cstate="print">
+                      <a:extLst>
+                        <a:ext uri="{28A0092B-C50C-407E-A947-70E740481C1C}">
+                          <a14:useLocalDpi xmlns:a14="http://schemas.microsoft.com/office/drawing/2010/main" val="0"/>
+                        </a:ext>
+                      </a:extLst>
+                    </a:blip>
+                    <a:srcRect/>
+                    <a:stretch>
+                      <a:fillRect/>
+                    </a:stretch>
+                  </pic:blipFill>
+                  <pic:spPr bwMode="auto">
+                    <a:xfrm>
+                      <a:off x="0" y="0"/>
+                      <a:ext cx="5943600" cy="2976880"/>
+                    </a:xfrm>
+                    <a:prstGeom prst="rect">
+                      <a:avLst/>
+                    </a:prstGeom>
+                    <a:noFill/>
+                    <a:ln>
+                      <a:noFill/>
+                    </a:ln>
+                  </pic:spPr>
+                </pic:pic>
+              </a:graphicData>
+            </a:graphic>
+          </wp:inline>
+        </w:drawing>
+      </w:r>
+      <w:r>
+        <w:rPr>
+          <w:noProof/>
+        </w:rPr>
+        <w:drawing>
+          <wp:inline distT="0" distB="0" distL="0" distR="0" wp14:anchorId="0F368599" wp14:editId="79BE7DF6">
+            <wp:extent cx="5943600" cy="2984500"/>
+            <wp:effectExtent l="0" t="0" r="0" b="0"/>
+            <wp:docPr id="1998248531" name="Picture 3"/>
+            <wp:cNvGraphicFramePr>
+              <a:graphicFrameLocks xmlns:a="http://schemas.openxmlformats.org/drawingml/2006/main" noChangeAspect="1"/>
+            </wp:cNvGraphicFramePr>
+            <a:graphic xmlns:a="http://schemas.openxmlformats.org/drawingml/2006/main">
+              <a:graphicData uri="http://schemas.openxmlformats.org/drawingml/2006/picture">
+                <pic:pic xmlns:pic="http://schemas.openxmlformats.org/drawingml/2006/picture">
+                  <pic:nvPicPr>
+                    <pic:cNvPr id="0" name="Picture 428"/>
+                    <pic:cNvPicPr>
+                      <a:picLocks noChangeAspect="1" noChangeArrowheads="1"/>
+                    </pic:cNvPicPr>
+                  </pic:nvPicPr>
+                  <pic:blipFill>
+                    <a:blip r:embed="rId8" cstate="print">
+                      <a:extLst>
+                        <a:ext uri="{28A0092B-C50C-407E-A947-70E740481C1C}">
+                          <a14:useLocalDpi xmlns:a14="http://schemas.microsoft.com/office/drawing/2010/main" val="0"/>
+                        </a:ext>
+                      </a:extLst>
+                    </a:blip>
+                    <a:srcRect/>
+                    <a:stretch>
+                      <a:fillRect/>
+                    </a:stretch>
+                  </pic:blipFill>
+                  <pic:spPr bwMode="auto">
+                    <a:xfrm>
+                      <a:off x="0" y="0"/>
+                      <a:ext cx="5943600" cy="2984500"/>
+                    </a:xfrm>
+                    <a:prstGeom prst="rect">
+                      <a:avLst/>
+                    </a:prstGeom>
+                    <a:noFill/>
+                    <a:ln>
+                      <a:noFill/>
+                    </a:ln>
+                  </pic:spPr>
+                </pic:pic>
+              </a:graphicData>
+            </a:graphic>
+          </wp:inline>
+        </w:drawing>
+      </w:r>
+      <w:r>
+        <w:rPr>
+          <w:noProof/>
+        </w:rPr>
+        <w:lastRenderedPageBreak/>
+        <w:drawing>
+          <wp:inline distT="0" distB="0" distL="0" distR="0" wp14:anchorId="3ED23AAF" wp14:editId="1C440D4A">
+            <wp:extent cx="5943600" cy="2971800"/>
+            <wp:effectExtent l="0" t="0" r="0" b="0"/>
+            <wp:docPr id="1991339812" name="Picture 4"/>
+            <wp:cNvGraphicFramePr>
+              <a:graphicFrameLocks xmlns:a="http://schemas.openxmlformats.org/drawingml/2006/main" noChangeAspect="1"/>
+            </wp:cNvGraphicFramePr>
+            <a:graphic xmlns:a="http://schemas.openxmlformats.org/drawingml/2006/main">
+              <a:graphicData uri="http://schemas.openxmlformats.org/drawingml/2006/picture">
+                <pic:pic xmlns:pic="http://schemas.openxmlformats.org/drawingml/2006/picture">
+                  <pic:nvPicPr>
+                    <pic:cNvPr id="0" name="Picture 430"/>
+                    <pic:cNvPicPr>
+                      <a:picLocks noChangeAspect="1" noChangeArrowheads="1"/>
+                    </pic:cNvPicPr>
+                  </pic:nvPicPr>
+                  <pic:blipFill>
+                    <a:blip r:embed="rId9" cstate="print">
+                      <a:extLst>
+                        <a:ext uri="{28A0092B-C50C-407E-A947-70E740481C1C}">
+                          <a14:useLocalDpi xmlns:a14="http://schemas.microsoft.com/office/drawing/2010/main" val="0"/>
+                        </a:ext>
+                      </a:extLst>
+                    </a:blip>
+                    <a:srcRect/>
+                    <a:stretch>
+                      <a:fillRect/>
+                    </a:stretch>
+                  </pic:blipFill>
+                  <pic:spPr bwMode="auto">
+                    <a:xfrm>
+                      <a:off x="0" y="0"/>
+                      <a:ext cx="5943600" cy="2971800"/>
+                    </a:xfrm>
+                    <a:prstGeom prst="rect">
+                      <a:avLst/>
+                    </a:prstGeom>
+                    <a:noFill/>
+                    <a:ln>
+                      <a:noFill/>
+                    </a:ln>
+                  </pic:spPr>
+                </pic:pic>
+              </a:graphicData>
+            </a:graphic>
+          </wp:inline>
+        </w:drawing>
+      </w:r>
+      <w:r>
+        <w:rPr>
+          <w:noProof/>
+        </w:rPr>
+        <w:drawing>
+          <wp:inline distT="0" distB="0" distL="0" distR="0" wp14:anchorId="4B77A79F" wp14:editId="705587B5">
+            <wp:extent cx="5943600" cy="2903855"/>
+            <wp:effectExtent l="0" t="0" r="0" b="0"/>
+            <wp:docPr id="1034896931" name="Picture 5"/>
+            <wp:cNvGraphicFramePr>
+              <a:graphicFrameLocks xmlns:a="http://schemas.openxmlformats.org/drawingml/2006/main" noChangeAspect="1"/>
+            </wp:cNvGraphicFramePr>
+            <a:graphic xmlns:a="http://schemas.openxmlformats.org/drawingml/2006/main">
+              <a:graphicData uri="http://schemas.openxmlformats.org/drawingml/2006/picture">
+                <pic:pic xmlns:pic="http://schemas.openxmlformats.org/drawingml/2006/picture">
+                  <pic:nvPicPr>
+                    <pic:cNvPr id="0" name="Picture 432"/>
+                    <pic:cNvPicPr>
+                      <a:picLocks noChangeAspect="1" noChangeArrowheads="1"/>
+                    </pic:cNvPicPr>
+                  </pic:nvPicPr>
+                  <pic:blipFill>
+                    <a:blip r:embed="rId10" cstate="print">
+                      <a:extLst>
+                        <a:ext uri="{28A0092B-C50C-407E-A947-70E740481C1C}">
+                          <a14:useLocalDpi xmlns:a14="http://schemas.microsoft.com/office/drawing/2010/main" val="0"/>
+                        </a:ext>
+                      </a:extLst>
+                    </a:blip>
+                    <a:srcRect/>
+                    <a:stretch>
+                      <a:fillRect/>
+                    </a:stretch>
+                  </pic:blipFill>
+                  <pic:spPr bwMode="auto">
+                    <a:xfrm>
+                      <a:off x="0" y="0"/>
+                      <a:ext cx="5943600" cy="2903855"/>
+                    </a:xfrm>
+                    <a:prstGeom prst="rect">
+                      <a:avLst/>
+                    </a:prstGeom>
+                    <a:noFill/>
+                    <a:ln>
+                      <a:noFill/>
+                    </a:ln>
+                  </pic:spPr>
+                </pic:pic>
+              </a:graphicData>
+            </a:graphic>
+          </wp:inline>
+        </w:drawing>
+      </w:r>
+      <w:r>
+        <w:rPr>
+          <w:noProof/>
+        </w:rPr>
+        <w:lastRenderedPageBreak/>
+        <w:drawing>
+          <wp:inline distT="0" distB="0" distL="0" distR="0" wp14:anchorId="10DD7B33" wp14:editId="6B77DC91">
+            <wp:extent cx="5943600" cy="3051175"/>
+            <wp:effectExtent l="0" t="0" r="0" b="0"/>
+            <wp:docPr id="1723326039" name="Picture 6"/>
+            <wp:cNvGraphicFramePr>
+              <a:graphicFrameLocks xmlns:a="http://schemas.openxmlformats.org/drawingml/2006/main" noChangeAspect="1"/>
+            </wp:cNvGraphicFramePr>
+            <a:graphic xmlns:a="http://schemas.openxmlformats.org/drawingml/2006/main">
+              <a:graphicData uri="http://schemas.openxmlformats.org/drawingml/2006/picture">
+                <pic:pic xmlns:pic="http://schemas.openxmlformats.org/drawingml/2006/picture">
+                  <pic:nvPicPr>
+                    <pic:cNvPr id="0" name="Picture 434"/>
+                    <pic:cNvPicPr>
+                      <a:picLocks noChangeAspect="1" noChangeArrowheads="1"/>
+                    </pic:cNvPicPr>
+                  </pic:nvPicPr>
+                  <pic:blipFill>
+                    <a:blip r:embed="rId11" cstate="print">
+                      <a:extLst>
+                        <a:ext uri="{28A0092B-C50C-407E-A947-70E740481C1C}">
+                          <a14:useLocalDpi xmlns:a14="http://schemas.microsoft.com/office/drawing/2010/main" val="0"/>
+                        </a:ext>
+                      </a:extLst>
+                    </a:blip>
+                    <a:srcRect/>
+                    <a:stretch>
+                      <a:fillRect/>
+                    </a:stretch>
+                  </pic:blipFill>
+                  <pic:spPr bwMode="auto">
+                    <a:xfrm>
+                      <a:off x="0" y="0"/>
+                      <a:ext cx="5943600" cy="3051175"/>
+                    </a:xfrm>
+                    <a:prstGeom prst="rect">
+                      <a:avLst/>
+                    </a:prstGeom>
+                    <a:noFill/>
+                    <a:ln>
+                      <a:noFill/>
+                    </a:ln>
+                  </pic:spPr>
+                </pic:pic>
+              </a:graphicData>
+            </a:graphic>
+          </wp:inline>
+        </w:drawing>
+      </w:r>
+      <w:r>
+        <w:rPr>
+          <w:noProof/>
+        </w:rPr>
+        <w:drawing>
+          <wp:inline distT="0" distB="0" distL="0" distR="0" wp14:anchorId="6244680E" wp14:editId="6D803B82">
+            <wp:extent cx="5943600" cy="2988310"/>
+            <wp:effectExtent l="0" t="0" r="0" b="0"/>
+            <wp:docPr id="1020642991" name="Picture 7"/>
+            <wp:cNvGraphicFramePr>
+              <a:graphicFrameLocks xmlns:a="http://schemas.openxmlformats.org/drawingml/2006/main" noChangeAspect="1"/>
+            </wp:cNvGraphicFramePr>
+            <a:graphic xmlns:a="http://schemas.openxmlformats.org/drawingml/2006/main">
+              <a:graphicData uri="http://schemas.openxmlformats.org/drawingml/2006/picture">
+                <pic:pic xmlns:pic="http://schemas.openxmlformats.org/drawingml/2006/picture">
+                  <pic:nvPicPr>
+                    <pic:cNvPr id="0" name="Picture 436"/>
+                    <pic:cNvPicPr>
+                      <a:picLocks noChangeAspect="1" noChangeArrowheads="1"/>
+                    </pic:cNvPicPr>
+                  </pic:nvPicPr>
+                  <pic:blipFill>
+                    <a:blip r:embed="rId12" cstate="print">
+                      <a:extLst>
+                        <a:ext uri="{28A0092B-C50C-407E-A947-70E740481C1C}">
+                          <a14:useLocalDpi xmlns:a14="http://schemas.microsoft.com/office/drawing/2010/main" val="0"/>
+                        </a:ext>
+                      </a:extLst>
+                    </a:blip>
+                    <a:srcRect/>
+                    <a:stretch>
+                      <a:fillRect/>
+                    </a:stretch>
+                  </pic:blipFill>
+                  <pic:spPr bwMode="auto">
+                    <a:xfrm>
+                      <a:off x="0" y="0"/>
+                      <a:ext cx="5943600" cy="2988310"/>
+                    </a:xfrm>
+                    <a:prstGeom prst="rect">
+                      <a:avLst/>
+                    </a:prstGeom>
+                    <a:noFill/>
+                    <a:ln>
+                      <a:noFill/>
+                    </a:ln>
+                  </pic:spPr>
+                </pic:pic>
+              </a:graphicData>
+            </a:graphic>
+          </wp:inline>
+        </w:drawing>
+      </w:r>
+    </w:p>
+    <w:bookmarkEnd w:id="0"/>
+    <w:bookmarkEnd w:id="21"/>
     <w:p>
       <w:pPr>
         <w:pStyle w:val="FirstParagraph"/>
-      </w:pPr>
-      <w:r>
-        <w:t>The system is running in dev azure environemnt oncurrent audits without issues. It pulls files from Azure Blob Storage, processes them through OCR and vision AI, searches the knowledge base for relevant compliance info, and generates detailed audit reports.</w:t>
-      </w:r>
-      <w:bookmarkEnd w:id="0"/>
-      <w:bookmarkEnd w:id="21"/>
+        <w:rPr>
+          <w:rFonts w:ascii="Calibri" w:hAnsi="Calibri" w:cs="Calibri"/>
+        </w:rPr>
+      </w:pPr>
+    </w:p>
+    <w:p>
+      <w:pPr>
+        <w:pStyle w:val="BodyText"/>
+      </w:pPr>
+    </w:p>
+    <w:p>
+      <w:pPr>
+        <w:pStyle w:val="Heading2"/>
+        <w:rPr>
+          <w:rFonts w:ascii="Calibri" w:hAnsi="Calibri" w:cs="Calibri"/>
+        </w:rPr>
+      </w:pPr>
+      <w:r>
+        <w:rPr>
+          <w:rFonts w:ascii="Calibri" w:hAnsi="Calibri" w:cs="Calibri"/>
+        </w:rPr>
+        <w:t>9</w:t>
+      </w:r>
+      <w:r>
+        <w:rPr>
+          <w:rFonts w:ascii="Calibri" w:hAnsi="Calibri" w:cs="Calibri"/>
+        </w:rPr>
+        <w:t>. Conclusion</w:t>
+      </w:r>
+    </w:p>
+    <w:p>
+      <w:pPr>
+        <w:pStyle w:val="BodyText"/>
+      </w:pPr>
+      <w:r>
+        <w:rPr>
+          <w:rFonts w:ascii="Calibri" w:hAnsi="Calibri" w:cs="Calibri"/>
+        </w:rPr>
+        <w:t xml:space="preserve">The system is running in dev azure </w:t>
+      </w:r>
+      <w:r>
+        <w:rPr>
+          <w:rFonts w:ascii="Calibri" w:hAnsi="Calibri" w:cs="Calibri"/>
+        </w:rPr>
+        <w:t>environment</w:t>
+      </w:r>
+      <w:r>
+        <w:rPr>
+          <w:rFonts w:ascii="Calibri" w:hAnsi="Calibri" w:cs="Calibri"/>
+        </w:rPr>
+        <w:t xml:space="preserve"> on</w:t>
+      </w:r>
+      <w:r>
+        <w:rPr>
+          <w:rFonts w:ascii="Calibri" w:hAnsi="Calibri" w:cs="Calibri"/>
+        </w:rPr>
+        <w:t xml:space="preserve"> </w:t>
+      </w:r>
+      <w:r>
+        <w:rPr>
+          <w:rFonts w:ascii="Calibri" w:hAnsi="Calibri" w:cs="Calibri"/>
+        </w:rPr>
+        <w:t>current audits without issues. It pulls files from Azure Blob Storage, processes them through OCR and vision AI, searches the knowledge base for relevant compliance info, and generates detailed audit reports</w:t>
+      </w:r>
+      <w:r>
+        <w:rPr>
+          <w:rFonts w:ascii="Calibri" w:hAnsi="Calibri" w:cs="Calibri"/>
+        </w:rPr>
+        <w:t>.</w:t>
+      </w:r>
+    </w:p>
+    <w:p>
+      <w:pPr>
+        <w:pStyle w:val="BodyText"/>
+      </w:pPr>
     </w:p>
     <w:sectPr>
       <w:footnotePr>
@@ -1956,10 +3303,10 @@
 </file>
 
 <file path=word/numbering.xml><?xml version="1.0" encoding="utf-8"?>
-<w:numbering xmlns:wpc="http://schemas.microsoft.com/office/word/2010/wordprocessingCanvas" xmlns:cx="http://schemas.microsoft.com/office/drawing/2014/chartex" xmlns:cx1="http://schemas.microsoft.com/office/drawing/2015/9/8/chartex" xmlns:cx2="http://schemas.microsoft.com/office/drawing/2015/10/21/chartex" xmlns:cx3="http://schemas.microsoft.com/office/drawing/2016/5/9/chartex" xmlns:cx4="http://schemas.microsoft.com/office/drawing/2016/5/10/chartex" xmlns:cx5="http://schemas.microsoft.com/office/drawing/2016/5/11/chartex" xmlns:cx6="http://schemas.microsoft.com/office/drawing/2016/5/12/chartex" xmlns:cx7="http://schemas.microsoft.com/office/drawing/2016/5/13/chartex" xmlns:cx8="http://schemas.microsoft.com/office/drawing/2016/5/14/chartex" xmlns:mc="http://schemas.openxmlformats.org/markup-compatibility/2006" xmlns:aink="http://schemas.microsoft.com/office/drawing/2016/ink" xmlns:am3d="http://schemas.microsoft.com/office/drawing/2017/model3d" xmlns:o="urn:schemas-microsoft-com:office:office" xmlns:oel="http://schemas.microsoft.com/office/2019/extlst" xmlns:r="http://schemas.openxmlformats.org/officeDocument/2006/relationships" xmlns:m="http://schemas.openxmlformats.org/officeDocument/2006/math" xmlns:v="urn:schemas-microsoft-com:vml" xmlns:wp14="http://schemas.microsoft.com/office/word/2010/wordprocessingDrawing" xmlns:wp="http://schemas.openxmlformats.org/drawingml/2006/wordprocessingDrawing" xmlns:w10="urn:schemas-microsoft-com:office:word" xmlns:w="http://schemas.openxmlformats.org/wordprocessingml/2006/main" xmlns:w14="http://schemas.microsoft.com/office/word/2010/wordml" xmlns:w15="http://schemas.microsoft.com/office/word/2012/wordml" xmlns:w16cex="http://schemas.microsoft.com/office/word/2018/wordml/cex" xmlns:w16cid="http://schemas.microsoft.com/office/word/2016/wordml/cid" xmlns:w16="http://schemas.microsoft.com/office/word/2018/wordml" xmlns:w16du="http://schemas.microsoft.com/office/word/2023/wordml/word16du" xmlns:w16sdtdh="http://schemas.microsoft.com/office/word/2020/wordml/sdtdatahash" xmlns:w16se="http://schemas.microsoft.com/office/word/2015/wordml/symex" xmlns:wpg="http://schemas.microsoft.com/office/word/2010/wordprocessingGroup" xmlns:wpi="http://schemas.microsoft.com/office/word/2010/wordprocessingInk" xmlns:wne="http://schemas.microsoft.com/office/word/2006/wordml" xmlns:wps="http://schemas.microsoft.com/office/word/2010/wordprocessingShape" mc:Ignorable="w14 w15 w16se w16cid w16 w16cex w16sdtdh w16du wp14">
+<w:numbering xmlns:wpc="http://schemas.microsoft.com/office/word/2010/wordprocessingCanvas" xmlns:cx="http://schemas.microsoft.com/office/drawing/2014/chartex" xmlns:cx1="http://schemas.microsoft.com/office/drawing/2015/9/8/chartex" xmlns:cx2="http://schemas.microsoft.com/office/drawing/2015/10/21/chartex" xmlns:cx3="http://schemas.microsoft.com/office/drawing/2016/5/9/chartex" xmlns:cx4="http://schemas.microsoft.com/office/drawing/2016/5/10/chartex" xmlns:cx5="http://schemas.microsoft.com/office/drawing/2016/5/11/chartex" xmlns:cx6="http://schemas.microsoft.com/office/drawing/2016/5/12/chartex" xmlns:cx7="http://schemas.microsoft.com/office/drawing/2016/5/13/chartex" xmlns:cx8="http://schemas.microsoft.com/office/drawing/2016/5/14/chartex" xmlns:mc="http://schemas.openxmlformats.org/markup-compatibility/2006" xmlns:aink="http://schemas.microsoft.com/office/drawing/2016/ink" xmlns:am3d="http://schemas.microsoft.com/office/drawing/2017/model3d" xmlns:o="urn:schemas-microsoft-com:office:office" xmlns:oel="http://schemas.microsoft.com/office/2019/extlst" xmlns:r="http://schemas.openxmlformats.org/officeDocument/2006/relationships" xmlns:m="http://schemas.openxmlformats.org/officeDocument/2006/math" xmlns:v="urn:schemas-microsoft-com:vml" xmlns:wp14="http://schemas.microsoft.com/office/word/2010/wordprocessingDrawing" xmlns:wp="http://schemas.openxmlformats.org/drawingml/2006/wordprocessingDrawing" xmlns:w10="urn:schemas-microsoft-com:office:word" xmlns:w="http://schemas.openxmlformats.org/wordprocessingml/2006/main" xmlns:w14="http://schemas.microsoft.com/office/word/2010/wordml" xmlns:w15="http://schemas.microsoft.com/office/word/2012/wordml" xmlns:w16cex="http://schemas.microsoft.com/office/word/2018/wordml/cex" xmlns:w16cid="http://schemas.microsoft.com/office/word/2016/wordml/cid" xmlns:w16="http://schemas.microsoft.com/office/word/2018/wordml" xmlns:w16sdtdh="http://schemas.microsoft.com/office/word/2020/wordml/sdtdatahash" xmlns:w16se="http://schemas.microsoft.com/office/word/2015/wordml/symex" xmlns:wpg="http://schemas.microsoft.com/office/word/2010/wordprocessingGroup" xmlns:wpi="http://schemas.microsoft.com/office/word/2010/wordprocessingInk" xmlns:wne="http://schemas.microsoft.com/office/word/2006/wordml" xmlns:wps="http://schemas.microsoft.com/office/word/2010/wordprocessingShape" mc:Ignorable="w14 w15 w16se w16cid w16 w16cex w16sdtdh wp14">
   <w:numPicBullet w:numPicBulletId="0">
     <w:pict>
-      <v:rect id="_x0000_i1037" style="width:0;height:1.5pt" o:hralign="center" o:bullet="t" o:hrstd="t" o:hr="t"/>
+      <v:rect id="_x0000_i1086" style="width:0;height:1.5pt" o:hralign="center" o:bullet="t" o:hrstd="t" o:hr="t"/>
     </w:pict>
   </w:numPicBullet>
   <w:abstractNum w:abstractNumId="0" w15:restartNumberingAfterBreak="0">
@@ -2296,7 +3643,7 @@
 </file>
 
 <file path=word/styles.xml><?xml version="1.0" encoding="utf-8"?>
-<w:styles xmlns:mc="http://schemas.openxmlformats.org/markup-compatibility/2006" xmlns:r="http://schemas.openxmlformats.org/officeDocument/2006/relationships" xmlns:w="http://schemas.openxmlformats.org/wordprocessingml/2006/main" xmlns:w14="http://schemas.microsoft.com/office/word/2010/wordml" xmlns:w15="http://schemas.microsoft.com/office/word/2012/wordml" xmlns:w16cex="http://schemas.microsoft.com/office/word/2018/wordml/cex" xmlns:w16cid="http://schemas.microsoft.com/office/word/2016/wordml/cid" xmlns:w16="http://schemas.microsoft.com/office/word/2018/wordml" xmlns:w16du="http://schemas.microsoft.com/office/word/2023/wordml/word16du" xmlns:w16sdtdh="http://schemas.microsoft.com/office/word/2020/wordml/sdtdatahash" xmlns:w16se="http://schemas.microsoft.com/office/word/2015/wordml/symex" mc:Ignorable="w14 w15 w16se w16cid w16 w16cex w16sdtdh w16du">
+<w:styles xmlns:mc="http://schemas.openxmlformats.org/markup-compatibility/2006" xmlns:r="http://schemas.openxmlformats.org/officeDocument/2006/relationships" xmlns:w="http://schemas.openxmlformats.org/wordprocessingml/2006/main" xmlns:w14="http://schemas.microsoft.com/office/word/2010/wordml" xmlns:w15="http://schemas.microsoft.com/office/word/2012/wordml" xmlns:w16cex="http://schemas.microsoft.com/office/word/2018/wordml/cex" xmlns:w16cid="http://schemas.microsoft.com/office/word/2016/wordml/cid" xmlns:w16="http://schemas.microsoft.com/office/word/2018/wordml" xmlns:w16sdtdh="http://schemas.microsoft.com/office/word/2020/wordml/sdtdatahash" xmlns:w16se="http://schemas.microsoft.com/office/word/2015/wordml/symex" mc:Ignorable="w14 w15 w16se w16cid w16 w16cex w16sdtdh">
   <w:docDefaults>
     <w:rPrDefault>
       <w:rPr>

</xml_diff>